<commit_message>
docs: plan de bloques, Spring Boot 4.1 y guía para arrancar el backend
- docs/propuestas: plan de bloques 4.0 y mini propuesta de B1 aprobados.
- AGENTS.md y Doc.docx: Spring Boot 4.1, bloques de la fase 4 y decisiones del 28/10.
- Guía de instalación: nota de http.sslBackend schannel.
- Nueva guía docs/guias/arrancar-backend.md y sección "Arrancar en local" del README.

Co-Authored-By: Claude Opus 5.5 <noreply@anthropic.com>
Claude-Session: https://claude.ai/code/session_0172dfujDXGdapHgWC5xBCFt
</commit_message>
<xml_diff>
--- a/docs/Doc.docx
+++ b/docs/Doc.docx
@@ -181,7 +181,7 @@
                 <w:sz w:val="20"/>
                 <w:szCs w:val="20"/>
               </w:rPr>
-              <w:t xml:space="preserve">0.1</w:t>
+              <w:t>0.2</w:t>
             </w:r>
           </w:p>
         </w:tc>
@@ -241,7 +241,7 @@
                 <w:sz w:val="20"/>
                 <w:szCs w:val="20"/>
               </w:rPr>
-              <w:t xml:space="preserve">25 de octubre de 2026</w:t>
+              <w:t>28 de octubre de 2026</w:t>
             </w:r>
           </w:p>
         </w:tc>
@@ -6233,7 +6233,7 @@
                 <w:sz w:val="20"/>
                 <w:szCs w:val="20"/>
               </w:rPr>
-              <w:t xml:space="preserve">Java 21 (LTS) + Spring Boot 3: Web, Data JPA, Validation y Security. API REST.</w:t>
+              <w:t>Java 21 (LTS) + Spring Boot 4.1: Web MVC, Data JPA, Validation y Security. API REST. (Spring Boot 3 cambiado a 4.1 el 28/10/2026.)</w:t>
             </w:r>
           </w:p>
         </w:tc>
@@ -28525,6 +28525,631 @@
         </w:numPr>
       </w:pPr>
       <w:r>
+        <w:t>Desarrollo (fase 4)</w:t>
+      </w:r>
+    </w:p>
+    <w:p>
+      <w:pPr>
+        <w:spacing w:after="120"/>
+      </w:pPr>
+      <w:r>
+        <w:t>Plan de bloques aprobado en el paso 4.0 (detalle en propuestas/4.0-plan-de-bloques.md). Un hilo, una rama feature/... y uno o varios pull requests por bloque; cada bloque trae sus pruebas. Orden: primero el backend (B1 a B6) y después la web (B7 a B9).</w:t>
+      </w:r>
+    </w:p>
+    <w:tbl>
+      <w:tblPr>
+        <w:tblW w:type="dxa" w:w="9026"/>
+        <w:tblBorders>
+          <w:top w:val="single" w:color="auto" w:sz="4"/>
+          <w:left w:val="single" w:color="auto" w:sz="4"/>
+          <w:bottom w:val="single" w:color="auto" w:sz="4"/>
+          <w:right w:val="single" w:color="auto" w:sz="4"/>
+          <w:insideH w:val="single" w:color="auto" w:sz="4"/>
+          <w:insideV w:val="single" w:color="auto" w:sz="4"/>
+        </w:tblBorders>
+      </w:tblPr>
+      <w:tblGrid>
+        <w:gridCol w:w="2600"/>
+        <w:gridCol w:w="6426"/>
+      </w:tblGrid>
+      <w:tr>
+        <w:trPr>
+          <w:tblHeader/>
+        </w:trPr>
+        <w:tc>
+          <w:tcPr>
+            <w:tcW w:type="dxa" w:w="2600"/>
+            <w:tcBorders>
+              <w:top w:val="single" w:color="A6A6A6" w:sz="4"/>
+              <w:left w:val="single" w:color="A6A6A6" w:sz="4"/>
+              <w:bottom w:val="single" w:color="A6A6A6" w:sz="4"/>
+              <w:right w:val="single" w:color="A6A6A6" w:sz="4"/>
+            </w:tcBorders>
+            <w:shd w:fill="1F4E79" w:color="auto" w:val="clear"/>
+            <w:tcMar>
+              <w:top w:type="dxa" w:w="60"/>
+              <w:left w:type="dxa" w:w="100"/>
+              <w:bottom w:type="dxa" w:w="60"/>
+              <w:right w:type="dxa" w:w="100"/>
+            </w:tcMar>
+          </w:tcPr>
+          <w:p>
+            <w:r>
+              <w:rPr>
+                <w:b/>
+                <w:bCs/>
+                <w:color w:val="FFFFFF"/>
+                <w:sz w:val="20"/>
+                <w:szCs w:val="20"/>
+              </w:rPr>
+              <w:t>Bloque</w:t>
+            </w:r>
+          </w:p>
+        </w:tc>
+        <w:tc>
+          <w:tcPr>
+            <w:tcW w:type="dxa" w:w="6426"/>
+            <w:tcBorders>
+              <w:top w:val="single" w:color="A6A6A6" w:sz="4"/>
+              <w:left w:val="single" w:color="A6A6A6" w:sz="4"/>
+              <w:bottom w:val="single" w:color="A6A6A6" w:sz="4"/>
+              <w:right w:val="single" w:color="A6A6A6" w:sz="4"/>
+            </w:tcBorders>
+            <w:shd w:fill="1F4E79" w:color="auto" w:val="clear"/>
+            <w:tcMar>
+              <w:top w:type="dxa" w:w="60"/>
+              <w:left w:type="dxa" w:w="100"/>
+              <w:bottom w:type="dxa" w:w="60"/>
+              <w:right w:type="dxa" w:w="100"/>
+            </w:tcMar>
+          </w:tcPr>
+          <w:p>
+            <w:r>
+              <w:rPr>
+                <w:b/>
+                <w:bCs/>
+                <w:color w:val="FFFFFF"/>
+                <w:sz w:val="20"/>
+                <w:szCs w:val="20"/>
+              </w:rPr>
+              <w:t>Contenido</w:t>
+            </w:r>
+          </w:p>
+        </w:tc>
+      </w:tr>
+      <w:tr>
+        <w:tc>
+          <w:tcPr>
+            <w:tcW w:type="dxa" w:w="2600"/>
+            <w:tcBorders>
+              <w:top w:val="single" w:color="A6A6A6" w:sz="4"/>
+              <w:left w:val="single" w:color="A6A6A6" w:sz="4"/>
+              <w:bottom w:val="single" w:color="A6A6A6" w:sz="4"/>
+              <w:right w:val="single" w:color="A6A6A6" w:sz="4"/>
+            </w:tcBorders>
+            <w:tcMar>
+              <w:top w:type="dxa" w:w="60"/>
+              <w:left w:type="dxa" w:w="100"/>
+              <w:bottom w:type="dxa" w:w="60"/>
+              <w:right w:type="dxa" w:w="100"/>
+            </w:tcMar>
+          </w:tcPr>
+          <w:p>
+            <w:r>
+              <w:rPr>
+                <w:b w:val="false"/>
+                <w:bCs w:val="false"/>
+                <w:sz w:val="20"/>
+                <w:szCs w:val="20"/>
+              </w:rPr>
+              <w:t>B1 · Esqueleto</w:t>
+            </w:r>
+          </w:p>
+        </w:tc>
+        <w:tc>
+          <w:tcPr>
+            <w:tcW w:type="dxa" w:w="6426"/>
+            <w:tcBorders>
+              <w:top w:val="single" w:color="A6A6A6" w:sz="4"/>
+              <w:left w:val="single" w:color="A6A6A6" w:sz="4"/>
+              <w:bottom w:val="single" w:color="A6A6A6" w:sz="4"/>
+              <w:right w:val="single" w:color="A6A6A6" w:sz="4"/>
+            </w:tcBorders>
+            <w:tcMar>
+              <w:top w:type="dxa" w:w="60"/>
+              <w:left w:type="dxa" w:w="100"/>
+              <w:bottom w:type="dxa" w:w="60"/>
+              <w:right w:type="dxa" w:w="100"/>
+            </w:tcMar>
+          </w:tcPr>
+          <w:p>
+            <w:r>
+              <w:rPr>
+                <w:b w:val="false"/>
+                <w:bCs w:val="false"/>
+                <w:sz w:val="20"/>
+                <w:szCs w:val="20"/>
+              </w:rPr>
+              <w:t>Proyecto Spring Boot 4.1 con Maven Wrapper y los paquetes del paso 3.2; docker-compose con PostgreSQL 16; Flyway V1 (esquema) y V2 (registro del negocio); Problem Details, Clock inyectable, Swagger, seguridad provisional; pruebas con Testcontainers y CI. Detalle en propuestas/4.1-B1-esqueleto-backend.md.</w:t>
+            </w:r>
+          </w:p>
+        </w:tc>
+      </w:tr>
+      <w:tr>
+        <w:tc>
+          <w:tcPr>
+            <w:tcW w:type="dxa" w:w="2600"/>
+            <w:tcBorders>
+              <w:top w:val="single" w:color="A6A6A6" w:sz="4"/>
+              <w:left w:val="single" w:color="A6A6A6" w:sz="4"/>
+              <w:bottom w:val="single" w:color="A6A6A6" w:sz="4"/>
+              <w:right w:val="single" w:color="A6A6A6" w:sz="4"/>
+            </w:tcBorders>
+            <w:tcMar>
+              <w:top w:type="dxa" w:w="60"/>
+              <w:left w:type="dxa" w:w="100"/>
+              <w:bottom w:type="dxa" w:w="60"/>
+              <w:right w:type="dxa" w:w="100"/>
+            </w:tcMar>
+          </w:tcPr>
+          <w:p>
+            <w:r>
+              <w:rPr>
+                <w:b w:val="false"/>
+                <w:bCs w:val="false"/>
+                <w:sz w:val="20"/>
+                <w:szCs w:val="20"/>
+              </w:rPr>
+              <w:t>B2 · Autenticación</w:t>
+            </w:r>
+          </w:p>
+        </w:tc>
+        <w:tc>
+          <w:tcPr>
+            <w:tcW w:type="dxa" w:w="6426"/>
+            <w:tcBorders>
+              <w:top w:val="single" w:color="A6A6A6" w:sz="4"/>
+              <w:left w:val="single" w:color="A6A6A6" w:sz="4"/>
+              <w:bottom w:val="single" w:color="A6A6A6" w:sz="4"/>
+              <w:right w:val="single" w:color="A6A6A6" w:sz="4"/>
+            </w:tcBorders>
+            <w:tcMar>
+              <w:top w:type="dxa" w:w="60"/>
+              <w:left w:type="dxa" w:w="100"/>
+              <w:bottom w:type="dxa" w:w="60"/>
+              <w:right w:type="dxa" w:w="100"/>
+            </w:tcMar>
+          </w:tcPr>
+          <w:p>
+            <w:r>
+              <w:rPr>
+                <w:b w:val="false"/>
+                <w:bCs w:val="false"/>
+                <w:sz w:val="20"/>
+                <w:szCs w:val="20"/>
+              </w:rPr>
+              <w:t>Registro, login, JWT + refresh token con rotación, logout, roles por ruta, límite de intentos, /me y cambio de contraseña. Primer administrador desde ADMIN_EMAIL y ADMIN_PASSWORD.</w:t>
+            </w:r>
+          </w:p>
+        </w:tc>
+      </w:tr>
+      <w:tr>
+        <w:tc>
+          <w:tcPr>
+            <w:tcW w:type="dxa" w:w="2600"/>
+            <w:tcBorders>
+              <w:top w:val="single" w:color="A6A6A6" w:sz="4"/>
+              <w:left w:val="single" w:color="A6A6A6" w:sz="4"/>
+              <w:bottom w:val="single" w:color="A6A6A6" w:sz="4"/>
+              <w:right w:val="single" w:color="A6A6A6" w:sz="4"/>
+            </w:tcBorders>
+            <w:tcMar>
+              <w:top w:type="dxa" w:w="60"/>
+              <w:left w:type="dxa" w:w="100"/>
+              <w:bottom w:type="dxa" w:w="60"/>
+              <w:right w:type="dxa" w:w="100"/>
+            </w:tcMar>
+          </w:tcPr>
+          <w:p>
+            <w:r>
+              <w:rPr>
+                <w:b w:val="false"/>
+                <w:bCs w:val="false"/>
+                <w:sz w:val="20"/>
+                <w:szCs w:val="20"/>
+              </w:rPr>
+              <w:t>B3 · Cuenta y RGPD</w:t>
+            </w:r>
+          </w:p>
+        </w:tc>
+        <w:tc>
+          <w:tcPr>
+            <w:tcW w:type="dxa" w:w="6426"/>
+            <w:tcBorders>
+              <w:top w:val="single" w:color="A6A6A6" w:sz="4"/>
+              <w:left w:val="single" w:color="A6A6A6" w:sz="4"/>
+              <w:bottom w:val="single" w:color="A6A6A6" w:sz="4"/>
+              <w:right w:val="single" w:color="A6A6A6" w:sz="4"/>
+            </w:tcBorders>
+            <w:tcMar>
+              <w:top w:type="dxa" w:w="60"/>
+              <w:left w:type="dxa" w:w="100"/>
+              <w:bottom w:type="dxa" w:w="60"/>
+              <w:right w:type="dxa" w:w="100"/>
+            </w:tcMar>
+          </w:tcPr>
+          <w:p>
+            <w:r>
+              <w:rPr>
+                <w:b w:val="false"/>
+                <w:bCs w:val="false"/>
+                <w:sz w:val="20"/>
+                <w:szCs w:val="20"/>
+              </w:rPr>
+              <w:t>Recuperar contraseña por correo (Mailpit en local), GET /me/datos y DELETE /me con anonimización.</w:t>
+            </w:r>
+          </w:p>
+        </w:tc>
+      </w:tr>
+      <w:tr>
+        <w:tc>
+          <w:tcPr>
+            <w:tcW w:type="dxa" w:w="2600"/>
+            <w:tcBorders>
+              <w:top w:val="single" w:color="A6A6A6" w:sz="4"/>
+              <w:left w:val="single" w:color="A6A6A6" w:sz="4"/>
+              <w:bottom w:val="single" w:color="A6A6A6" w:sz="4"/>
+              <w:right w:val="single" w:color="A6A6A6" w:sz="4"/>
+            </w:tcBorders>
+            <w:tcMar>
+              <w:top w:type="dxa" w:w="60"/>
+              <w:left w:type="dxa" w:w="100"/>
+              <w:bottom w:type="dxa" w:w="60"/>
+              <w:right w:type="dxa" w:w="100"/>
+            </w:tcMar>
+          </w:tcPr>
+          <w:p>
+            <w:r>
+              <w:rPr>
+                <w:b w:val="false"/>
+                <w:bCs w:val="false"/>
+                <w:sz w:val="20"/>
+                <w:szCs w:val="20"/>
+              </w:rPr>
+              <w:t>B4 · Catálogo y empleados</w:t>
+            </w:r>
+          </w:p>
+        </w:tc>
+        <w:tc>
+          <w:tcPr>
+            <w:tcW w:type="dxa" w:w="6426"/>
+            <w:tcBorders>
+              <w:top w:val="single" w:color="A6A6A6" w:sz="4"/>
+              <w:left w:val="single" w:color="A6A6A6" w:sz="4"/>
+              <w:bottom w:val="single" w:color="A6A6A6" w:sz="4"/>
+              <w:right w:val="single" w:color="A6A6A6" w:sz="4"/>
+            </w:tcBorders>
+            <w:tcMar>
+              <w:top w:type="dxa" w:w="60"/>
+              <w:left w:type="dxa" w:w="100"/>
+              <w:bottom w:type="dxa" w:w="60"/>
+              <w:right w:type="dxa" w:w="100"/>
+            </w:tcMar>
+          </w:tcPr>
+          <w:p>
+            <w:r>
+              <w:rPr>
+                <w:b w:val="false"/>
+                <w:bCs w:val="false"/>
+                <w:sz w:val="20"/>
+                <w:szCs w:val="20"/>
+              </w:rPr>
+              <w:t>Servicios, empleados y configuración del negocio (admin); /servicios y /profesionales públicos; perfil demo.</w:t>
+            </w:r>
+          </w:p>
+        </w:tc>
+      </w:tr>
+      <w:tr>
+        <w:tc>
+          <w:tcPr>
+            <w:tcW w:type="dxa" w:w="2600"/>
+            <w:tcBorders>
+              <w:top w:val="single" w:color="A6A6A6" w:sz="4"/>
+              <w:left w:val="single" w:color="A6A6A6" w:sz="4"/>
+              <w:bottom w:val="single" w:color="A6A6A6" w:sz="4"/>
+              <w:right w:val="single" w:color="A6A6A6" w:sz="4"/>
+            </w:tcBorders>
+            <w:tcMar>
+              <w:top w:type="dxa" w:w="60"/>
+              <w:left w:type="dxa" w:w="100"/>
+              <w:bottom w:type="dxa" w:w="60"/>
+              <w:right w:type="dxa" w:w="100"/>
+            </w:tcMar>
+          </w:tcPr>
+          <w:p>
+            <w:r>
+              <w:rPr>
+                <w:b w:val="false"/>
+                <w:bCs w:val="false"/>
+                <w:sz w:val="20"/>
+                <w:szCs w:val="20"/>
+              </w:rPr>
+              <w:t>B5 · Horarios y disponibilidad</w:t>
+            </w:r>
+          </w:p>
+        </w:tc>
+        <w:tc>
+          <w:tcPr>
+            <w:tcW w:type="dxa" w:w="6426"/>
+            <w:tcBorders>
+              <w:top w:val="single" w:color="A6A6A6" w:sz="4"/>
+              <w:left w:val="single" w:color="A6A6A6" w:sz="4"/>
+              <w:bottom w:val="single" w:color="A6A6A6" w:sz="4"/>
+              <w:right w:val="single" w:color="A6A6A6" w:sz="4"/>
+            </w:tcBorders>
+            <w:tcMar>
+              <w:top w:type="dxa" w:w="60"/>
+              <w:left w:type="dxa" w:w="100"/>
+              <w:bottom w:type="dxa" w:w="60"/>
+              <w:right w:type="dxa" w:w="100"/>
+            </w:tcMar>
+          </w:tcPr>
+          <w:p>
+            <w:r>
+              <w:rPr>
+                <w:b w:val="false"/>
+                <w:bCs w:val="false"/>
+                <w:sz w:val="20"/>
+                <w:szCs w:val="20"/>
+              </w:rPr>
+              <w:t>Horario general, ajuste por empleado, días de cierre y DisponibilidadService; GET /disponibilidad.</w:t>
+            </w:r>
+          </w:p>
+        </w:tc>
+      </w:tr>
+      <w:tr>
+        <w:tc>
+          <w:tcPr>
+            <w:tcW w:type="dxa" w:w="2600"/>
+            <w:tcBorders>
+              <w:top w:val="single" w:color="A6A6A6" w:sz="4"/>
+              <w:left w:val="single" w:color="A6A6A6" w:sz="4"/>
+              <w:bottom w:val="single" w:color="A6A6A6" w:sz="4"/>
+              <w:right w:val="single" w:color="A6A6A6" w:sz="4"/>
+            </w:tcBorders>
+            <w:tcMar>
+              <w:top w:type="dxa" w:w="60"/>
+              <w:left w:type="dxa" w:w="100"/>
+              <w:bottom w:type="dxa" w:w="60"/>
+              <w:right w:type="dxa" w:w="100"/>
+            </w:tcMar>
+          </w:tcPr>
+          <w:p>
+            <w:r>
+              <w:rPr>
+                <w:b w:val="false"/>
+                <w:bCs w:val="false"/>
+                <w:sz w:val="20"/>
+                <w:szCs w:val="20"/>
+              </w:rPr>
+              <w:t>B6 · Citas</w:t>
+            </w:r>
+          </w:p>
+        </w:tc>
+        <w:tc>
+          <w:tcPr>
+            <w:tcW w:type="dxa" w:w="6426"/>
+            <w:tcBorders>
+              <w:top w:val="single" w:color="A6A6A6" w:sz="4"/>
+              <w:left w:val="single" w:color="A6A6A6" w:sz="4"/>
+              <w:bottom w:val="single" w:color="A6A6A6" w:sz="4"/>
+              <w:right w:val="single" w:color="A6A6A6" w:sz="4"/>
+            </w:tcBorders>
+            <w:tcMar>
+              <w:top w:type="dxa" w:w="60"/>
+              <w:left w:type="dxa" w:w="100"/>
+              <w:bottom w:type="dxa" w:w="60"/>
+              <w:right w:type="dxa" w:w="100"/>
+            </w:tcMar>
+          </w:tcPr>
+          <w:p>
+            <w:r>
+              <w:rPr>
+                <w:b w:val="false"/>
+                <w:bCs w:val="false"/>
+                <w:sz w:val="20"/>
+                <w:szCs w:val="20"/>
+              </w:rPr>
+              <w:t>Beneficiarios, reservar (409 si hay solape), mis citas, cancelar con plazo de 24 h, agenda del empleado y gestión de reservas.</w:t>
+            </w:r>
+          </w:p>
+        </w:tc>
+      </w:tr>
+      <w:tr>
+        <w:tc>
+          <w:tcPr>
+            <w:tcW w:type="dxa" w:w="2600"/>
+            <w:tcBorders>
+              <w:top w:val="single" w:color="A6A6A6" w:sz="4"/>
+              <w:left w:val="single" w:color="A6A6A6" w:sz="4"/>
+              <w:bottom w:val="single" w:color="A6A6A6" w:sz="4"/>
+              <w:right w:val="single" w:color="A6A6A6" w:sz="4"/>
+            </w:tcBorders>
+            <w:tcMar>
+              <w:top w:type="dxa" w:w="60"/>
+              <w:left w:type="dxa" w:w="100"/>
+              <w:bottom w:type="dxa" w:w="60"/>
+              <w:right w:type="dxa" w:w="100"/>
+            </w:tcMar>
+          </w:tcPr>
+          <w:p>
+            <w:r>
+              <w:rPr>
+                <w:b w:val="false"/>
+                <w:bCs w:val="false"/>
+                <w:sz w:val="20"/>
+                <w:szCs w:val="20"/>
+              </w:rPr>
+              <w:t>B7 · Web: base y zona pública</w:t>
+            </w:r>
+          </w:p>
+        </w:tc>
+        <w:tc>
+          <w:tcPr>
+            <w:tcW w:type="dxa" w:w="6426"/>
+            <w:tcBorders>
+              <w:top w:val="single" w:color="A6A6A6" w:sz="4"/>
+              <w:left w:val="single" w:color="A6A6A6" w:sz="4"/>
+              <w:bottom w:val="single" w:color="A6A6A6" w:sz="4"/>
+              <w:right w:val="single" w:color="A6A6A6" w:sz="4"/>
+            </w:tcBorders>
+            <w:tcMar>
+              <w:top w:type="dxa" w:w="60"/>
+              <w:left w:type="dxa" w:w="100"/>
+              <w:bottom w:type="dxa" w:w="60"/>
+              <w:right w:type="dxa" w:w="100"/>
+            </w:tcMar>
+          </w:tcPr>
+          <w:p>
+            <w:r>
+              <w:rPr>
+                <w:b w:val="false"/>
+                <w:bCs w:val="false"/>
+                <w:sz w:val="20"/>
+                <w:szCs w:val="20"/>
+              </w:rPr>
+              <w:t>Vite + React + TypeScript, cliente de la API, login, registro, catálogo y horarios libres; CI del frontend.</w:t>
+            </w:r>
+          </w:p>
+        </w:tc>
+      </w:tr>
+      <w:tr>
+        <w:tc>
+          <w:tcPr>
+            <w:tcW w:type="dxa" w:w="2600"/>
+            <w:tcBorders>
+              <w:top w:val="single" w:color="A6A6A6" w:sz="4"/>
+              <w:left w:val="single" w:color="A6A6A6" w:sz="4"/>
+              <w:bottom w:val="single" w:color="A6A6A6" w:sz="4"/>
+              <w:right w:val="single" w:color="A6A6A6" w:sz="4"/>
+            </w:tcBorders>
+            <w:tcMar>
+              <w:top w:type="dxa" w:w="60"/>
+              <w:left w:type="dxa" w:w="100"/>
+              <w:bottom w:type="dxa" w:w="60"/>
+              <w:right w:type="dxa" w:w="100"/>
+            </w:tcMar>
+          </w:tcPr>
+          <w:p>
+            <w:r>
+              <w:rPr>
+                <w:b w:val="false"/>
+                <w:bCs w:val="false"/>
+                <w:sz w:val="20"/>
+                <w:szCs w:val="20"/>
+              </w:rPr>
+              <w:t>B8 · Web: cliente</w:t>
+            </w:r>
+          </w:p>
+        </w:tc>
+        <w:tc>
+          <w:tcPr>
+            <w:tcW w:type="dxa" w:w="6426"/>
+            <w:tcBorders>
+              <w:top w:val="single" w:color="A6A6A6" w:sz="4"/>
+              <w:left w:val="single" w:color="A6A6A6" w:sz="4"/>
+              <w:bottom w:val="single" w:color="A6A6A6" w:sz="4"/>
+              <w:right w:val="single" w:color="A6A6A6" w:sz="4"/>
+            </w:tcBorders>
+            <w:tcMar>
+              <w:top w:type="dxa" w:w="60"/>
+              <w:left w:type="dxa" w:w="100"/>
+              <w:bottom w:type="dxa" w:w="60"/>
+              <w:right w:type="dxa" w:w="100"/>
+            </w:tcMar>
+          </w:tcPr>
+          <w:p>
+            <w:r>
+              <w:rPr>
+                <w:b w:val="false"/>
+                <w:bCs w:val="false"/>
+                <w:sz w:val="20"/>
+                <w:szCs w:val="20"/>
+              </w:rPr>
+              <w:t>Reservar (también para un menor), mis citas, cancelar, perfil y RGPD.</w:t>
+            </w:r>
+          </w:p>
+        </w:tc>
+      </w:tr>
+      <w:tr>
+        <w:tc>
+          <w:tcPr>
+            <w:tcW w:type="dxa" w:w="2600"/>
+            <w:tcBorders>
+              <w:top w:val="single" w:color="A6A6A6" w:sz="4"/>
+              <w:left w:val="single" w:color="A6A6A6" w:sz="4"/>
+              <w:bottom w:val="single" w:color="A6A6A6" w:sz="4"/>
+              <w:right w:val="single" w:color="A6A6A6" w:sz="4"/>
+            </w:tcBorders>
+            <w:tcMar>
+              <w:top w:type="dxa" w:w="60"/>
+              <w:left w:type="dxa" w:w="100"/>
+              <w:bottom w:type="dxa" w:w="60"/>
+              <w:right w:type="dxa" w:w="100"/>
+            </w:tcMar>
+          </w:tcPr>
+          <w:p>
+            <w:r>
+              <w:rPr>
+                <w:b w:val="false"/>
+                <w:bCs w:val="false"/>
+                <w:sz w:val="20"/>
+                <w:szCs w:val="20"/>
+              </w:rPr>
+              <w:t>B9 · Web: empleado y administrador</w:t>
+            </w:r>
+          </w:p>
+        </w:tc>
+        <w:tc>
+          <w:tcPr>
+            <w:tcW w:type="dxa" w:w="6426"/>
+            <w:tcBorders>
+              <w:top w:val="single" w:color="A6A6A6" w:sz="4"/>
+              <w:left w:val="single" w:color="A6A6A6" w:sz="4"/>
+              <w:bottom w:val="single" w:color="A6A6A6" w:sz="4"/>
+              <w:right w:val="single" w:color="A6A6A6" w:sz="4"/>
+            </w:tcBorders>
+            <w:tcMar>
+              <w:top w:type="dxa" w:w="60"/>
+              <w:left w:type="dxa" w:w="100"/>
+              <w:bottom w:type="dxa" w:w="60"/>
+              <w:right w:type="dxa" w:w="100"/>
+            </w:tcMar>
+          </w:tcPr>
+          <w:p>
+            <w:r>
+              <w:rPr>
+                <w:b w:val="false"/>
+                <w:bCs w:val="false"/>
+                <w:sz w:val="20"/>
+                <w:szCs w:val="20"/>
+              </w:rPr>
+              <w:t>Agenda del empleado y panel del administrador.</w:t>
+            </w:r>
+          </w:p>
+        </w:tc>
+      </w:tr>
+    </w:tbl>
+    <w:p/>
+    <w:p>
+      <w:pPr>
+        <w:pStyle w:val="Heading1"/>
+        <w:numPr>
+          <w:ilvl w:val="0"/>
+          <w:numId w:val="2"/>
+        </w:numPr>
+      </w:pPr>
+      <w:r>
         <w:t xml:space="preserve">Registro de decisiones</w:t>
       </w:r>
     </w:p>
@@ -30139,6 +30764,306 @@
                 <w:szCs w:val="20"/>
               </w:rPr>
               <w:t xml:space="preserve">Entorno instalado. Node.js 24 LTS en lugar de 22, porque la 22 pasó a mantenimiento.</w:t>
+            </w:r>
+          </w:p>
+        </w:tc>
+      </w:tr>
+      <w:tr>
+        <w:tc>
+          <w:tcPr>
+            <w:tcW w:type="dxa" w:w="1700"/>
+            <w:tcBorders>
+              <w:top w:val="single" w:color="A6A6A6" w:sz="4"/>
+              <w:left w:val="single" w:color="A6A6A6" w:sz="4"/>
+              <w:bottom w:val="single" w:color="A6A6A6" w:sz="4"/>
+              <w:right w:val="single" w:color="A6A6A6" w:sz="4"/>
+            </w:tcBorders>
+            <w:shd w:fill="DCE9F5" w:color="auto" w:val="clear"/>
+            <w:tcMar>
+              <w:top w:type="dxa" w:w="60"/>
+              <w:left w:type="dxa" w:w="100"/>
+              <w:bottom w:type="dxa" w:w="60"/>
+              <w:right w:type="dxa" w:w="100"/>
+            </w:tcMar>
+          </w:tcPr>
+          <w:p>
+            <w:r>
+              <w:rPr>
+                <w:b w:val="false"/>
+                <w:bCs w:val="false"/>
+                <w:sz w:val="20"/>
+                <w:szCs w:val="20"/>
+              </w:rPr>
+              <w:t>28/10/2026</w:t>
+            </w:r>
+          </w:p>
+        </w:tc>
+        <w:tc>
+          <w:tcPr>
+            <w:tcW w:type="dxa" w:w="7326"/>
+            <w:tcBorders>
+              <w:top w:val="single" w:color="A6A6A6" w:sz="4"/>
+              <w:left w:val="single" w:color="A6A6A6" w:sz="4"/>
+              <w:bottom w:val="single" w:color="A6A6A6" w:sz="4"/>
+              <w:right w:val="single" w:color="A6A6A6" w:sz="4"/>
+            </w:tcBorders>
+            <w:shd w:fill="DCE9F5" w:color="auto" w:val="clear"/>
+            <w:tcMar>
+              <w:top w:type="dxa" w:w="60"/>
+              <w:left w:type="dxa" w:w="100"/>
+              <w:bottom w:type="dxa" w:w="60"/>
+              <w:right w:type="dxa" w:w="100"/>
+            </w:tcMar>
+          </w:tcPr>
+          <w:p>
+            <w:r>
+              <w:rPr>
+                <w:b w:val="false"/>
+                <w:bCs w:val="false"/>
+                <w:sz w:val="20"/>
+                <w:szCs w:val="20"/>
+              </w:rPr>
+              <w:t>Repositorio creado en GitHub; la documentación pasa a docs/.</w:t>
+            </w:r>
+          </w:p>
+        </w:tc>
+      </w:tr>
+      <w:tr>
+        <w:tc>
+          <w:tcPr>
+            <w:tcW w:type="dxa" w:w="1700"/>
+            <w:tcBorders>
+              <w:top w:val="single" w:color="A6A6A6" w:sz="4"/>
+              <w:left w:val="single" w:color="A6A6A6" w:sz="4"/>
+              <w:bottom w:val="single" w:color="A6A6A6" w:sz="4"/>
+              <w:right w:val="single" w:color="A6A6A6" w:sz="4"/>
+            </w:tcBorders>
+            <w:shd w:fill="DCE9F5" w:color="auto" w:val="clear"/>
+            <w:tcMar>
+              <w:top w:type="dxa" w:w="60"/>
+              <w:left w:type="dxa" w:w="100"/>
+              <w:bottom w:type="dxa" w:w="60"/>
+              <w:right w:type="dxa" w:w="100"/>
+            </w:tcMar>
+          </w:tcPr>
+          <w:p>
+            <w:r>
+              <w:rPr>
+                <w:b w:val="false"/>
+                <w:bCs w:val="false"/>
+                <w:sz w:val="20"/>
+                <w:szCs w:val="20"/>
+              </w:rPr>
+              <w:t>28/10/2026</w:t>
+            </w:r>
+          </w:p>
+        </w:tc>
+        <w:tc>
+          <w:tcPr>
+            <w:tcW w:type="dxa" w:w="7326"/>
+            <w:tcBorders>
+              <w:top w:val="single" w:color="A6A6A6" w:sz="4"/>
+              <w:left w:val="single" w:color="A6A6A6" w:sz="4"/>
+              <w:bottom w:val="single" w:color="A6A6A6" w:sz="4"/>
+              <w:right w:val="single" w:color="A6A6A6" w:sz="4"/>
+            </w:tcBorders>
+            <w:shd w:fill="DCE9F5" w:color="auto" w:val="clear"/>
+            <w:tcMar>
+              <w:top w:type="dxa" w:w="60"/>
+              <w:left w:type="dxa" w:w="100"/>
+              <w:bottom w:type="dxa" w:w="60"/>
+              <w:right w:type="dxa" w:w="100"/>
+            </w:tcMar>
+          </w:tcPr>
+          <w:p>
+            <w:r>
+              <w:rPr>
+                <w:b w:val="false"/>
+                <w:bCs w:val="false"/>
+                <w:sz w:val="20"/>
+                <w:szCs w:val="20"/>
+              </w:rPr>
+              <w:t>Paso 4.0 aprobado: plan de bloques de la fase 4 (B1 a B9), backend primero y web después.</w:t>
+            </w:r>
+          </w:p>
+        </w:tc>
+      </w:tr>
+      <w:tr>
+        <w:tc>
+          <w:tcPr>
+            <w:tcW w:type="dxa" w:w="1700"/>
+            <w:tcBorders>
+              <w:top w:val="single" w:color="A6A6A6" w:sz="4"/>
+              <w:left w:val="single" w:color="A6A6A6" w:sz="4"/>
+              <w:bottom w:val="single" w:color="A6A6A6" w:sz="4"/>
+              <w:right w:val="single" w:color="A6A6A6" w:sz="4"/>
+            </w:tcBorders>
+            <w:shd w:fill="DCE9F5" w:color="auto" w:val="clear"/>
+            <w:tcMar>
+              <w:top w:type="dxa" w:w="60"/>
+              <w:left w:type="dxa" w:w="100"/>
+              <w:bottom w:type="dxa" w:w="60"/>
+              <w:right w:type="dxa" w:w="100"/>
+            </w:tcMar>
+          </w:tcPr>
+          <w:p>
+            <w:r>
+              <w:rPr>
+                <w:b w:val="false"/>
+                <w:bCs w:val="false"/>
+                <w:sz w:val="20"/>
+                <w:szCs w:val="20"/>
+              </w:rPr>
+              <w:t>28/10/2026</w:t>
+            </w:r>
+          </w:p>
+        </w:tc>
+        <w:tc>
+          <w:tcPr>
+            <w:tcW w:type="dxa" w:w="7326"/>
+            <w:tcBorders>
+              <w:top w:val="single" w:color="A6A6A6" w:sz="4"/>
+              <w:left w:val="single" w:color="A6A6A6" w:sz="4"/>
+              <w:bottom w:val="single" w:color="A6A6A6" w:sz="4"/>
+              <w:right w:val="single" w:color="A6A6A6" w:sz="4"/>
+            </w:tcBorders>
+            <w:shd w:fill="DCE9F5" w:color="auto" w:val="clear"/>
+            <w:tcMar>
+              <w:top w:type="dxa" w:w="60"/>
+              <w:left w:type="dxa" w:w="100"/>
+              <w:bottom w:type="dxa" w:w="60"/>
+              <w:right w:type="dxa" w:w="100"/>
+            </w:tcMar>
+          </w:tcPr>
+          <w:p>
+            <w:r>
+              <w:rPr>
+                <w:b w:val="false"/>
+                <w:bCs w:val="false"/>
+                <w:sz w:val="20"/>
+                <w:szCs w:val="20"/>
+              </w:rPr>
+              <w:t>Spring Boot 4.1 en lugar de 3.x (la 3.5 está al final de su soporte gratuito).</w:t>
+            </w:r>
+          </w:p>
+        </w:tc>
+      </w:tr>
+      <w:tr>
+        <w:tc>
+          <w:tcPr>
+            <w:tcW w:type="dxa" w:w="1700"/>
+            <w:tcBorders>
+              <w:top w:val="single" w:color="A6A6A6" w:sz="4"/>
+              <w:left w:val="single" w:color="A6A6A6" w:sz="4"/>
+              <w:bottom w:val="single" w:color="A6A6A6" w:sz="4"/>
+              <w:right w:val="single" w:color="A6A6A6" w:sz="4"/>
+            </w:tcBorders>
+            <w:shd w:fill="DCE9F5" w:color="auto" w:val="clear"/>
+            <w:tcMar>
+              <w:top w:type="dxa" w:w="60"/>
+              <w:left w:type="dxa" w:w="100"/>
+              <w:bottom w:type="dxa" w:w="60"/>
+              <w:right w:type="dxa" w:w="100"/>
+            </w:tcMar>
+          </w:tcPr>
+          <w:p>
+            <w:r>
+              <w:rPr>
+                <w:b w:val="false"/>
+                <w:bCs w:val="false"/>
+                <w:sz w:val="20"/>
+                <w:szCs w:val="20"/>
+              </w:rPr>
+              <w:t>28/10/2026</w:t>
+            </w:r>
+          </w:p>
+        </w:tc>
+        <w:tc>
+          <w:tcPr>
+            <w:tcW w:type="dxa" w:w="7326"/>
+            <w:tcBorders>
+              <w:top w:val="single" w:color="A6A6A6" w:sz="4"/>
+              <w:left w:val="single" w:color="A6A6A6" w:sz="4"/>
+              <w:bottom w:val="single" w:color="A6A6A6" w:sz="4"/>
+              <w:right w:val="single" w:color="A6A6A6" w:sz="4"/>
+            </w:tcBorders>
+            <w:shd w:fill="DCE9F5" w:color="auto" w:val="clear"/>
+            <w:tcMar>
+              <w:top w:type="dxa" w:w="60"/>
+              <w:left w:type="dxa" w:w="100"/>
+              <w:bottom w:type="dxa" w:w="60"/>
+              <w:right w:type="dxa" w:w="100"/>
+            </w:tcMar>
+          </w:tcPr>
+          <w:p>
+            <w:r>
+              <w:rPr>
+                <w:b w:val="false"/>
+                <w:bCs w:val="false"/>
+                <w:sz w:val="20"/>
+                <w:szCs w:val="20"/>
+              </w:rPr>
+              <w:t>Datos iniciales: V2 solo con el registro del negocio; el primer administrador se crea al arrancar desde ADMIN_EMAIL y ADMIN_PASSWORD (B2); datos de demostración en un perfil demo.</w:t>
+            </w:r>
+          </w:p>
+        </w:tc>
+      </w:tr>
+      <w:tr>
+        <w:tc>
+          <w:tcPr>
+            <w:tcW w:type="dxa" w:w="1700"/>
+            <w:tcBorders>
+              <w:top w:val="single" w:color="A6A6A6" w:sz="4"/>
+              <w:left w:val="single" w:color="A6A6A6" w:sz="4"/>
+              <w:bottom w:val="single" w:color="A6A6A6" w:sz="4"/>
+              <w:right w:val="single" w:color="A6A6A6" w:sz="4"/>
+            </w:tcBorders>
+            <w:shd w:fill="DCE9F5" w:color="auto" w:val="clear"/>
+            <w:tcMar>
+              <w:top w:type="dxa" w:w="60"/>
+              <w:left w:type="dxa" w:w="100"/>
+              <w:bottom w:type="dxa" w:w="60"/>
+              <w:right w:type="dxa" w:w="100"/>
+            </w:tcMar>
+          </w:tcPr>
+          <w:p>
+            <w:r>
+              <w:rPr>
+                <w:b w:val="false"/>
+                <w:bCs w:val="false"/>
+                <w:sz w:val="20"/>
+                <w:szCs w:val="20"/>
+              </w:rPr>
+              <w:t>28/10/2026</w:t>
+            </w:r>
+          </w:p>
+        </w:tc>
+        <w:tc>
+          <w:tcPr>
+            <w:tcW w:type="dxa" w:w="7326"/>
+            <w:tcBorders>
+              <w:top w:val="single" w:color="A6A6A6" w:sz="4"/>
+              <w:left w:val="single" w:color="A6A6A6" w:sz="4"/>
+              <w:bottom w:val="single" w:color="A6A6A6" w:sz="4"/>
+              <w:right w:val="single" w:color="A6A6A6" w:sz="4"/>
+            </w:tcBorders>
+            <w:shd w:fill="DCE9F5" w:color="auto" w:val="clear"/>
+            <w:tcMar>
+              <w:top w:type="dxa" w:w="60"/>
+              <w:left w:type="dxa" w:w="100"/>
+              <w:bottom w:type="dxa" w:w="60"/>
+              <w:right w:type="dxa" w:w="100"/>
+            </w:tcMar>
+          </w:tcPr>
+          <w:p>
+            <w:r>
+              <w:rPr>
+                <w:b w:val="false"/>
+                <w:bCs w:val="false"/>
+                <w:sz w:val="20"/>
+                <w:szCs w:val="20"/>
+              </w:rPr>
+              <w:t>B1 aprobado: esqueleto del backend, docker-compose, Flyway y CI en la rama feature/esqueleto-backend.</w:t>
             </w:r>
           </w:p>
         </w:tc>

</xml_diff>

<commit_message>
fix: PostgreSQL de Docker en el puerto 5433 para convivir con otro PostgreSQL
En el PC de Jose, Odoo tiene un PostgreSQL de Windows en el puerto 5432 y el
backend se conectaba a ese en lugar de al de Docker (fallo de contraseña).

- docker-compose publica 5433:5432; .env.example y application.yml usan 5433.
- Guía de arranque, README, AGENTS.md (B1 hecho) y Doc.docx actualizados.

Co-Authored-By: Claude Opus 5.5 <noreply@anthropic.com>
Claude-Session: https://claude.ai/code/session_0172dfujDXGdapHgWC5xBCFt
</commit_message>
<xml_diff>
--- a/docs/Doc.docx
+++ b/docs/Doc.docx
@@ -31068,6 +31068,66 @@
           </w:p>
         </w:tc>
       </w:tr>
+      <w:tr>
+        <w:tc>
+          <w:tcPr>
+            <w:tcW w:type="dxa" w:w="1700"/>
+            <w:tcBorders>
+              <w:top w:val="single" w:color="A6A6A6" w:sz="4"/>
+              <w:left w:val="single" w:color="A6A6A6" w:sz="4"/>
+              <w:bottom w:val="single" w:color="A6A6A6" w:sz="4"/>
+              <w:right w:val="single" w:color="A6A6A6" w:sz="4"/>
+            </w:tcBorders>
+            <w:shd w:fill="DCE9F5" w:color="auto" w:val="clear"/>
+            <w:tcMar>
+              <w:top w:type="dxa" w:w="60"/>
+              <w:left w:type="dxa" w:w="100"/>
+              <w:bottom w:type="dxa" w:w="60"/>
+              <w:right w:type="dxa" w:w="100"/>
+            </w:tcMar>
+          </w:tcPr>
+          <w:p>
+            <w:r>
+              <w:rPr>
+                <w:b w:val="false"/>
+                <w:bCs w:val="false"/>
+                <w:sz w:val="20"/>
+                <w:szCs w:val="20"/>
+              </w:rPr>
+              <w:t>28/10/2026</w:t>
+            </w:r>
+          </w:p>
+        </w:tc>
+        <w:tc>
+          <w:tcPr>
+            <w:tcW w:type="dxa" w:w="7326"/>
+            <w:tcBorders>
+              <w:top w:val="single" w:color="A6A6A6" w:sz="4"/>
+              <w:left w:val="single" w:color="A6A6A6" w:sz="4"/>
+              <w:bottom w:val="single" w:color="A6A6A6" w:sz="4"/>
+              <w:right w:val="single" w:color="A6A6A6" w:sz="4"/>
+            </w:tcBorders>
+            <w:shd w:fill="DCE9F5" w:color="auto" w:val="clear"/>
+            <w:tcMar>
+              <w:top w:type="dxa" w:w="60"/>
+              <w:left w:type="dxa" w:w="100"/>
+              <w:bottom w:type="dxa" w:w="60"/>
+              <w:right w:type="dxa" w:w="100"/>
+            </w:tcMar>
+          </w:tcPr>
+          <w:p>
+            <w:r>
+              <w:rPr>
+                <w:b w:val="false"/>
+                <w:bCs w:val="false"/>
+                <w:sz w:val="20"/>
+                <w:szCs w:val="20"/>
+              </w:rPr>
+              <w:t>B1 fusionado (PR #1). El PostgreSQL de Docker usa el puerto 5433 del PC para convivir con otro PostgreSQL instalado en Windows.</w:t>
+            </w:r>
+          </w:p>
+        </w:tc>
+      </w:tr>
     </w:tbl>
     <w:sectPr>
       <w:pgSz w:w="11906" w:h="16838" w:orient="portrait"/>

</xml_diff>

<commit_message>
docs: propuesta del B2, guía para probar el login y .env.example
- docs/propuestas/4.2-B2-autenticacion.md (aprobada).
- AGENTS.md y Doc.docx: B2 hecho, ajustes sobre el paso 3.4 y registro de decisiones.
- Guía arrancar-backend.md: JWT_SECRET y ADMIN_* en el .env, y cómo probar
  registro, login y tokens con Swagger y PowerShell.
- .env.example y README con las variables nuevas.

Co-Authored-By: Claude Opus 5.5 <noreply@anthropic.com>
Claude-Session: https://claude.ai/code/session_0172dfukaNgM4EMTjrSSpVYN
</commit_message>
<xml_diff>
--- a/docs/Doc.docx
+++ b/docs/Doc.docx
@@ -27748,7 +27748,7 @@
                 <w:sz w:val="20"/>
                 <w:szCs w:val="20"/>
               </w:rPr>
-              <w:t xml:space="preserve">JWT de acceso (15 min, en memoria) + refresh token (7 días, cookie HttpOnly, Secure, SameSite=Strict) con rotación y revocación en la tabla refresh_token.</w:t>
+              <w:t xml:space="preserve">JWT de acceso (15 min, en memoria) + refresh token (7 días, cookie HttpOnly, Secure, SameSite=Strict, ruta /api/v1/auth) con rotación y revocación en la tabla refresh_token, donde solo se guarda su SHA-256 (ajuste del B2).</w:t>
             </w:r>
           </w:p>
         </w:tc>
@@ -28728,7 +28728,7 @@
                 <w:sz w:val="20"/>
                 <w:szCs w:val="20"/>
               </w:rPr>
-              <w:t>Registro, login, JWT + refresh token con rotación, logout, roles por ruta, límite de intentos, /me y cambio de contraseña. Primer administrador desde ADMIN_EMAIL y ADMIN_PASSWORD.</w:t>
+              <w:t>Registro, login, JWT + refresh token con rotación, logout, roles por ruta, límite de intentos, /me y cambio de contraseña. Primer administrador desde ADMIN_EMAIL y ADMIN_PASSWORD. Hecho (detalle en propuestas/4.2-B2-autenticacion.md).</w:t>
             </w:r>
           </w:p>
         </w:tc>
@@ -31124,6 +31124,66 @@
                 <w:szCs w:val="20"/>
               </w:rPr>
               <w:t>B1 fusionado (PR #1). El PostgreSQL de Docker usa el puerto 5433 del PC para convivir con otro PostgreSQL instalado en Windows.</w:t>
+            </w:r>
+          </w:p>
+        </w:tc>
+      </w:tr>
+      <w:tr>
+        <w:tc>
+          <w:tcPr>
+            <w:tcW w:type="dxa" w:w="1700"/>
+            <w:tcBorders>
+              <w:top w:val="single" w:color="A6A6A6" w:sz="4"/>
+              <w:left w:val="single" w:color="A6A6A6" w:sz="4"/>
+              <w:bottom w:val="single" w:color="A6A6A6" w:sz="4"/>
+              <w:right w:val="single" w:color="A6A6A6" w:sz="4"/>
+            </w:tcBorders>
+            <w:shd w:fill="DCE9F5" w:color="auto" w:val="clear"/>
+            <w:tcMar>
+              <w:top w:type="dxa" w:w="60"/>
+              <w:left w:type="dxa" w:w="100"/>
+              <w:bottom w:type="dxa" w:w="60"/>
+              <w:right w:type="dxa" w:w="100"/>
+            </w:tcMar>
+          </w:tcPr>
+          <w:p>
+            <w:r>
+              <w:rPr>
+                <w:b w:val="false"/>
+                <w:bCs w:val="false"/>
+                <w:sz w:val="20"/>
+                <w:szCs w:val="20"/>
+              </w:rPr>
+              <w:t>28/10/2026</w:t>
+            </w:r>
+          </w:p>
+        </w:tc>
+        <w:tc>
+          <w:tcPr>
+            <w:tcW w:type="dxa" w:w="7326"/>
+            <w:tcBorders>
+              <w:top w:val="single" w:color="A6A6A6" w:sz="4"/>
+              <w:left w:val="single" w:color="A6A6A6" w:sz="4"/>
+              <w:bottom w:val="single" w:color="A6A6A6" w:sz="4"/>
+              <w:right w:val="single" w:color="A6A6A6" w:sz="4"/>
+            </w:tcBorders>
+            <w:shd w:fill="DCE9F5" w:color="auto" w:val="clear"/>
+            <w:tcMar>
+              <w:top w:type="dxa" w:w="60"/>
+              <w:left w:type="dxa" w:w="100"/>
+              <w:bottom w:type="dxa" w:w="60"/>
+              <w:right w:type="dxa" w:w="100"/>
+            </w:tcMar>
+          </w:tcPr>
+          <w:p>
+            <w:r>
+              <w:rPr>
+                <w:b w:val="false"/>
+                <w:bCs w:val="false"/>
+                <w:sz w:val="20"/>
+                <w:szCs w:val="20"/>
+              </w:rPr>
+              <w:t>B2 aprobado: autenticación en la rama feature/autenticacion. Cambios sobre el paso 3.4: el refresh token se guarda con SHA-256 (no con BCrypt), la cookie va en /api/v1/auth, el logout funciona solo con la cookie y se añade el código 429. El registro no inicia sesión.</w:t>
             </w:r>
           </w:p>
         </w:tc>

</xml_diff>

<commit_message>
docs: propuesta del B3, guía para probar la recuperación y el RGPD
- docs/propuestas/4.3-B3-cuenta-rgpd.md (aprobada).
- AGENTS.md y Doc.docx: B3 hecho, reglas de cuenta y RGPD, tareas que quedan
  para el B6 y registro de decisiones.
- Guía arrancar-backend.md: variables de correo, Mailpit y pruebas paso a paso
  de recuperar contraseña, exportar datos y eliminar la cuenta.
- .env.example y README con Mailpit.

Co-Authored-By: Claude Opus 5.5 <noreply@anthropic.com>
Claude-Session: https://claude.ai/code/session_0172dfumkryuzv9Xjq1KZPvY
</commit_message>
<xml_diff>
--- a/docs/Doc.docx
+++ b/docs/Doc.docx
@@ -6647,7 +6647,7 @@
                 <w:sz w:val="20"/>
                 <w:szCs w:val="20"/>
               </w:rPr>
-              <w:t xml:space="preserve">Docker Compose para levantar PostgreSQL.</w:t>
+              <w:t>Docker Compose para levantar PostgreSQL y Mailpit (correo de pruebas en http://localhost:8025).</w:t>
             </w:r>
           </w:p>
         </w:tc>
@@ -27926,7 +27926,7 @@
                 <w:sz w:val="20"/>
                 <w:szCs w:val="20"/>
               </w:rPr>
-              <w:t xml:space="preserve">5 intentos de login por minuto; 3 recuperaciones de contraseña por hora; CORS restringido.</w:t>
+              <w:t>5 intentos de login por minuto por IP y por correo; 3 solicitudes de recuperación de contraseña por hora por correo y 10 por IP (B3); CORS restringido.</w:t>
             </w:r>
           </w:p>
         </w:tc>
@@ -28044,7 +28044,65 @@
                 <w:sz w:val="20"/>
                 <w:szCs w:val="20"/>
               </w:rPr>
-              <w:t xml:space="preserve">Consentimiento con fecha, GET /me/datos para exportar datos y anonimización al eliminar la cuenta.</w:t>
+              <w:t>Consentimiento con fecha; GET /me/datos exporta los datos personales en JSON; DELETE /me (solo clientes, con la contraseña) anonimiza la cuenta, la desactiva y marca usuario.eliminado_en (B3, migración V4).</w:t>
+            </w:r>
+          </w:p>
+        </w:tc>
+      </w:tr>
+      <w:tr>
+        <w:tc>
+          <w:tcPr>
+            <w:tcW w:type="dxa" w:w="2600"/>
+            <w:tcBorders>
+              <w:top w:val="single" w:color="A6A6A6" w:sz="4"/>
+              <w:left w:val="single" w:color="A6A6A6" w:sz="4"/>
+              <w:bottom w:val="single" w:color="A6A6A6" w:sz="4"/>
+              <w:right w:val="single" w:color="A6A6A6" w:sz="4"/>
+            </w:tcBorders>
+            <w:tcMar>
+              <w:top w:type="dxa" w:w="60"/>
+              <w:left w:type="dxa" w:w="100"/>
+              <w:bottom w:type="dxa" w:w="60"/>
+              <w:right w:type="dxa" w:w="100"/>
+            </w:tcMar>
+          </w:tcPr>
+          <w:p>
+            <w:r>
+              <w:rPr>
+                <w:b w:val="false"/>
+                <w:bCs w:val="false"/>
+                <w:sz w:val="20"/>
+                <w:szCs w:val="20"/>
+              </w:rPr>
+              <w:t>Recuperar contraseña</w:t>
+            </w:r>
+          </w:p>
+        </w:tc>
+        <w:tc>
+          <w:tcPr>
+            <w:tcW w:type="dxa" w:w="6426"/>
+            <w:tcBorders>
+              <w:top w:val="single" w:color="A6A6A6" w:sz="4"/>
+              <w:left w:val="single" w:color="A6A6A6" w:sz="4"/>
+              <w:bottom w:val="single" w:color="A6A6A6" w:sz="4"/>
+              <w:right w:val="single" w:color="A6A6A6" w:sz="4"/>
+            </w:tcBorders>
+            <w:tcMar>
+              <w:top w:type="dxa" w:w="60"/>
+              <w:left w:type="dxa" w:w="100"/>
+              <w:bottom w:type="dxa" w:w="60"/>
+              <w:right w:type="dxa" w:w="100"/>
+            </w:tcMar>
+          </w:tcPr>
+          <w:p>
+            <w:r>
+              <w:rPr>
+                <w:b w:val="false"/>
+                <w:bCs w:val="false"/>
+                <w:sz w:val="20"/>
+                <w:szCs w:val="20"/>
+              </w:rPr>
+              <w:t>Enlace de un solo uso que caduca en 30 minutos (en la BD solo su SHA-256), misma respuesta exista o no el correo y envío en segundo plano; al restablecer se cierran todas las sesiones (B3).</w:t>
             </w:r>
           </w:p>
         </w:tc>
@@ -28786,7 +28844,7 @@
                 <w:sz w:val="20"/>
                 <w:szCs w:val="20"/>
               </w:rPr>
-              <w:t>Recuperar contraseña por correo (Mailpit en local), GET /me/datos y DELETE /me con anonimización.</w:t>
+              <w:t>Recuperar contraseña por correo (Mailpit en local), GET /me/datos y DELETE /me con anonimización. Hecho (detalle en propuestas/4.3-B3-cuenta-rgpd.md). Queda para B6 añadir beneficiarios y citas a la exportación y a la eliminación.</w:t>
             </w:r>
           </w:p>
         </w:tc>
@@ -31184,6 +31242,126 @@
                 <w:szCs w:val="20"/>
               </w:rPr>
               <w:t>B2 aprobado: autenticación en la rama feature/autenticacion. Cambios sobre el paso 3.4: el refresh token se guarda con SHA-256 (no con BCrypt), la cookie va en /api/v1/auth, el logout funciona solo con la cookie y se añade el código 429. El registro no inicia sesión.</w:t>
+            </w:r>
+          </w:p>
+        </w:tc>
+      </w:tr>
+      <w:tr>
+        <w:tc>
+          <w:tcPr>
+            <w:tcW w:type="dxa" w:w="1700"/>
+            <w:tcBorders>
+              <w:top w:val="single" w:color="A6A6A6" w:sz="4"/>
+              <w:left w:val="single" w:color="A6A6A6" w:sz="4"/>
+              <w:bottom w:val="single" w:color="A6A6A6" w:sz="4"/>
+              <w:right w:val="single" w:color="A6A6A6" w:sz="4"/>
+            </w:tcBorders>
+            <w:shd w:fill="DCE9F5" w:color="auto" w:val="clear"/>
+            <w:tcMar>
+              <w:top w:type="dxa" w:w="60"/>
+              <w:left w:type="dxa" w:w="100"/>
+              <w:bottom w:type="dxa" w:w="60"/>
+              <w:right w:type="dxa" w:w="100"/>
+            </w:tcMar>
+          </w:tcPr>
+          <w:p>
+            <w:r>
+              <w:rPr>
+                <w:b w:val="false"/>
+                <w:bCs w:val="false"/>
+                <w:sz w:val="20"/>
+                <w:szCs w:val="20"/>
+              </w:rPr>
+              <w:t>28/10/2026</w:t>
+            </w:r>
+          </w:p>
+        </w:tc>
+        <w:tc>
+          <w:tcPr>
+            <w:tcW w:type="dxa" w:w="7326"/>
+            <w:tcBorders>
+              <w:top w:val="single" w:color="A6A6A6" w:sz="4"/>
+              <w:left w:val="single" w:color="A6A6A6" w:sz="4"/>
+              <w:bottom w:val="single" w:color="A6A6A6" w:sz="4"/>
+              <w:right w:val="single" w:color="A6A6A6" w:sz="4"/>
+            </w:tcBorders>
+            <w:shd w:fill="DCE9F5" w:color="auto" w:val="clear"/>
+            <w:tcMar>
+              <w:top w:type="dxa" w:w="60"/>
+              <w:left w:type="dxa" w:w="100"/>
+              <w:bottom w:type="dxa" w:w="60"/>
+              <w:right w:type="dxa" w:w="100"/>
+            </w:tcMar>
+          </w:tcPr>
+          <w:p>
+            <w:r>
+              <w:rPr>
+                <w:b w:val="false"/>
+                <w:bCs w:val="false"/>
+                <w:sz w:val="20"/>
+                <w:szCs w:val="20"/>
+              </w:rPr>
+              <w:t>B2 fusionado (PR #3).</w:t>
+            </w:r>
+          </w:p>
+        </w:tc>
+      </w:tr>
+      <w:tr>
+        <w:tc>
+          <w:tcPr>
+            <w:tcW w:type="dxa" w:w="1700"/>
+            <w:tcBorders>
+              <w:top w:val="single" w:color="A6A6A6" w:sz="4"/>
+              <w:left w:val="single" w:color="A6A6A6" w:sz="4"/>
+              <w:bottom w:val="single" w:color="A6A6A6" w:sz="4"/>
+              <w:right w:val="single" w:color="A6A6A6" w:sz="4"/>
+            </w:tcBorders>
+            <w:shd w:fill="DCE9F5" w:color="auto" w:val="clear"/>
+            <w:tcMar>
+              <w:top w:type="dxa" w:w="60"/>
+              <w:left w:type="dxa" w:w="100"/>
+              <w:bottom w:type="dxa" w:w="60"/>
+              <w:right w:type="dxa" w:w="100"/>
+            </w:tcMar>
+          </w:tcPr>
+          <w:p>
+            <w:r>
+              <w:rPr>
+                <w:b w:val="false"/>
+                <w:bCs w:val="false"/>
+                <w:sz w:val="20"/>
+                <w:szCs w:val="20"/>
+              </w:rPr>
+              <w:t>28/10/2026</w:t>
+            </w:r>
+          </w:p>
+        </w:tc>
+        <w:tc>
+          <w:tcPr>
+            <w:tcW w:type="dxa" w:w="7326"/>
+            <w:tcBorders>
+              <w:top w:val="single" w:color="A6A6A6" w:sz="4"/>
+              <w:left w:val="single" w:color="A6A6A6" w:sz="4"/>
+              <w:bottom w:val="single" w:color="A6A6A6" w:sz="4"/>
+              <w:right w:val="single" w:color="A6A6A6" w:sz="4"/>
+            </w:tcBorders>
+            <w:shd w:fill="DCE9F5" w:color="auto" w:val="clear"/>
+            <w:tcMar>
+              <w:top w:type="dxa" w:w="60"/>
+              <w:left w:type="dxa" w:w="100"/>
+              <w:bottom w:type="dxa" w:w="60"/>
+              <w:right w:type="dxa" w:w="100"/>
+            </w:tcMar>
+          </w:tcPr>
+          <w:p>
+            <w:r>
+              <w:rPr>
+                <w:b w:val="false"/>
+                <w:bCs w:val="false"/>
+                <w:sz w:val="20"/>
+                <w:szCs w:val="20"/>
+              </w:rPr>
+              <w:t>B3 aprobado: cuenta y RGPD en la rama feature/recuperar-password-rgpd. Migración V4 (usuario.eliminado_en y fecha de nacimiento que admite vacío); solo los clientes eliminan su cuenta; al eliminarla, B6 cancelará sus citas futuras; DELETE /me con la contraseña en el cuerpo; Mailpit para el correo en local.</w:t>
             </w:r>
           </w:p>
         </w:tc>

</xml_diff>

<commit_message>
docs: propuesta del B4 y guía para probar el catálogo y los empleados
- docs/propuestas/4.4-B4-catalogo-empleados.md (aprobada).
- AGENTS.md y Doc.docx: B4 hecho, reglas del catálogo y los empleados,
  tareas que quedan para el B5 (datos de demo) y el B6 (CitasFuturas) y
  registro de decisiones.
- Guía arrancar-backend.md: sección 7.8 para probar servicios, empleados,
  profesionales y la configuración del negocio con Swagger.

Co-Authored-By: Claude Opus 5.5 <noreply@anthropic.com>
Claude-Session: https://claude.ai/code/session_0172dfunhPfL9TpWncrJ1rck
</commit_message>
<xml_diff>
--- a/docs/Doc.docx
+++ b/docs/Doc.docx
@@ -28902,7 +28902,7 @@
                 <w:sz w:val="20"/>
                 <w:szCs w:val="20"/>
               </w:rPr>
-              <w:t>Servicios, empleados y configuración del negocio (admin); /servicios y /profesionales públicos; perfil demo.</w:t>
+              <w:t>Servicios con duración múltiplo del intervalo (RN-011), empleados con contraseña temporal y sus servicios, configuración del negocio (admin); /servicios y /profesionales públicos; /empleado/servicios. Migración V5. Hecho (detalle en propuestas/4.4-B4-catalogo-empleados.md). Los datos de demo pasan al B5 y B6 sustituirá la consulta provisional CitasFuturasJdbc.</w:t>
             </w:r>
           </w:p>
         </w:tc>
@@ -28960,7 +28960,7 @@
                 <w:sz w:val="20"/>
                 <w:szCs w:val="20"/>
               </w:rPr>
-              <w:t>Horario general, ajuste por empleado, días de cierre y DisponibilidadService; GET /disponibilidad.</w:t>
+              <w:t>Horario general, ajuste por empleado, días de cierre y DisponibilidadService; GET /disponibilidad; datos de demostración (perfil demo).</w:t>
             </w:r>
           </w:p>
         </w:tc>
@@ -31362,6 +31362,66 @@
                 <w:szCs w:val="20"/>
               </w:rPr>
               <w:t>B3 aprobado: cuenta y RGPD en la rama feature/recuperar-password-rgpd. Migración V4 (usuario.eliminado_en y fecha de nacimiento que admite vacío); solo los clientes eliminan su cuenta; al eliminarla, B6 cancelará sus citas futuras; DELETE /me con la contraseña en el cuerpo; Mailpit para el correo en local.</w:t>
+            </w:r>
+          </w:p>
+        </w:tc>
+      </w:tr>
+      <w:tr>
+        <w:tc>
+          <w:tcPr>
+            <w:tcW w:type="dxa" w:w="1700"/>
+            <w:tcBorders>
+              <w:top w:val="single" w:color="A6A6A6" w:sz="4"/>
+              <w:left w:val="single" w:color="A6A6A6" w:sz="4"/>
+              <w:bottom w:val="single" w:color="A6A6A6" w:sz="4"/>
+              <w:right w:val="single" w:color="A6A6A6" w:sz="4"/>
+            </w:tcBorders>
+            <w:shd w:fill="DCE9F5" w:color="auto" w:val="clear"/>
+            <w:tcMar>
+              <w:top w:type="dxa" w:w="60"/>
+              <w:left w:type="dxa" w:w="100"/>
+              <w:bottom w:type="dxa" w:w="60"/>
+              <w:right w:type="dxa" w:w="100"/>
+            </w:tcMar>
+          </w:tcPr>
+          <w:p>
+            <w:r>
+              <w:rPr>
+                <w:b w:val="false"/>
+                <w:bCs w:val="false"/>
+                <w:sz w:val="20"/>
+                <w:szCs w:val="20"/>
+              </w:rPr>
+              <w:t>28/10/2026</w:t>
+            </w:r>
+          </w:p>
+        </w:tc>
+        <w:tc>
+          <w:tcPr>
+            <w:tcW w:type="dxa" w:w="7326"/>
+            <w:tcBorders>
+              <w:top w:val="single" w:color="A6A6A6" w:sz="4"/>
+              <w:left w:val="single" w:color="A6A6A6" w:sz="4"/>
+              <w:bottom w:val="single" w:color="A6A6A6" w:sz="4"/>
+              <w:right w:val="single" w:color="A6A6A6" w:sz="4"/>
+            </w:tcBorders>
+            <w:shd w:fill="DCE9F5" w:color="auto" w:val="clear"/>
+            <w:tcMar>
+              <w:top w:type="dxa" w:w="60"/>
+              <w:left w:type="dxa" w:w="100"/>
+              <w:bottom w:type="dxa" w:w="60"/>
+              <w:right w:type="dxa" w:w="100"/>
+            </w:tcMar>
+          </w:tcPr>
+          <w:p>
+            <w:r>
+              <w:rPr>
+                <w:b w:val="false"/>
+                <w:bCs w:val="false"/>
+                <w:sz w:val="20"/>
+                <w:szCs w:val="20"/>
+              </w:rPr>
+              <w:t>B4 aprobado: catálogo y empleados en la rama feature/catalogo-empleados. Migración V5 (nombre de servicio único sin distinguir mayúsculas); profesionales públicos con nombre e inicial del apellido; 409 al desactivar un empleado con citas futuras; endpoint para generar otra contraseña temporal; intervalo limitado a 5, 10, 15, 20, 30 o 60 minutos; datos de demo en el B5.</w:t>
             </w:r>
           </w:p>
         </w:tc>

</xml_diff>

<commit_message>
docs: propuesta del B5, guía para probar horarios y demo y DEMO_PASSWORD
Co-Authored-By: Claude Opus 5.5 <noreply@anthropic.com>
Claude-Session: https://claude.ai/code/session_0172dfuop23bbtC6521wckxH
</commit_message>
<xml_diff>
--- a/docs/Doc.docx
+++ b/docs/Doc.docx
@@ -28960,7 +28960,7 @@
                 <w:sz w:val="20"/>
                 <w:szCs w:val="20"/>
               </w:rPr>
-              <w:t>Horario general, ajuste por empleado, días de cierre y DisponibilidadService; GET /disponibilidad; datos de demostración (perfil demo).</w:t>
+              <w:t>Horario general, ajuste por empleado día a día (tabla ajuste_horario, migración V6) y días de cierre del negocio o de un empleado; al guardarlos se listan las citas afectadas sin cancelarlas. GET /disponibilidad público con el cálculo en CalculoDisponibilidad (sin Spring) y sugerencia del siguiente día con huecos. Datos de demostración en el perfil demo con DEMO_PASSWORD. Hecho (detalle en propuestas/4.5-B5-horarios-disponibilidad.md). B6 sustituirá la consulta provisional OcupacionesProfesionalJdbc.</w:t>
             </w:r>
           </w:p>
         </w:tc>
@@ -31422,6 +31422,126 @@
                 <w:szCs w:val="20"/>
               </w:rPr>
               <w:t>B4 aprobado: catálogo y empleados en la rama feature/catalogo-empleados. Migración V5 (nombre de servicio único sin distinguir mayúsculas); profesionales públicos con nombre e inicial del apellido; 409 al desactivar un empleado con citas futuras; endpoint para generar otra contraseña temporal; intervalo limitado a 5, 10, 15, 20, 30 o 60 minutos; datos de demo en el B5.</w:t>
+            </w:r>
+          </w:p>
+        </w:tc>
+      </w:tr>
+      <w:tr>
+        <w:tc>
+          <w:tcPr>
+            <w:tcW w:type="dxa" w:w="1700"/>
+            <w:tcBorders>
+              <w:top w:val="single" w:color="A6A6A6" w:sz="4"/>
+              <w:left w:val="single" w:color="A6A6A6" w:sz="4"/>
+              <w:bottom w:val="single" w:color="A6A6A6" w:sz="4"/>
+              <w:right w:val="single" w:color="A6A6A6" w:sz="4"/>
+            </w:tcBorders>
+            <w:shd w:fill="DCE9F5" w:color="auto" w:val="clear"/>
+            <w:tcMar>
+              <w:top w:type="dxa" w:w="60"/>
+              <w:left w:type="dxa" w:w="100"/>
+              <w:bottom w:type="dxa" w:w="60"/>
+              <w:right w:type="dxa" w:w="100"/>
+            </w:tcMar>
+          </w:tcPr>
+          <w:p>
+            <w:r>
+              <w:rPr>
+                <w:b w:val="false"/>
+                <w:bCs w:val="false"/>
+                <w:sz w:val="20"/>
+                <w:szCs w:val="20"/>
+              </w:rPr>
+              <w:t>28/10/2026</w:t>
+            </w:r>
+          </w:p>
+        </w:tc>
+        <w:tc>
+          <w:tcPr>
+            <w:tcW w:type="dxa" w:w="7326"/>
+            <w:tcBorders>
+              <w:top w:val="single" w:color="A6A6A6" w:sz="4"/>
+              <w:left w:val="single" w:color="A6A6A6" w:sz="4"/>
+              <w:bottom w:val="single" w:color="A6A6A6" w:sz="4"/>
+              <w:right w:val="single" w:color="A6A6A6" w:sz="4"/>
+            </w:tcBorders>
+            <w:shd w:fill="DCE9F5" w:color="auto" w:val="clear"/>
+            <w:tcMar>
+              <w:top w:type="dxa" w:w="60"/>
+              <w:left w:type="dxa" w:w="100"/>
+              <w:bottom w:type="dxa" w:w="60"/>
+              <w:right w:type="dxa" w:w="100"/>
+            </w:tcMar>
+          </w:tcPr>
+          <w:p>
+            <w:r>
+              <w:rPr>
+                <w:b w:val="false"/>
+                <w:bCs w:val="false"/>
+                <w:sz w:val="20"/>
+                <w:szCs w:val="20"/>
+              </w:rPr>
+              <w:t>B4 fusionado (PR #5).</w:t>
+            </w:r>
+          </w:p>
+        </w:tc>
+      </w:tr>
+      <w:tr>
+        <w:tc>
+          <w:tcPr>
+            <w:tcW w:type="dxa" w:w="1700"/>
+            <w:tcBorders>
+              <w:top w:val="single" w:color="A6A6A6" w:sz="4"/>
+              <w:left w:val="single" w:color="A6A6A6" w:sz="4"/>
+              <w:bottom w:val="single" w:color="A6A6A6" w:sz="4"/>
+              <w:right w:val="single" w:color="A6A6A6" w:sz="4"/>
+            </w:tcBorders>
+            <w:shd w:fill="DCE9F5" w:color="auto" w:val="clear"/>
+            <w:tcMar>
+              <w:top w:type="dxa" w:w="60"/>
+              <w:left w:type="dxa" w:w="100"/>
+              <w:bottom w:type="dxa" w:w="60"/>
+              <w:right w:type="dxa" w:w="100"/>
+            </w:tcMar>
+          </w:tcPr>
+          <w:p>
+            <w:r>
+              <w:rPr>
+                <w:b w:val="false"/>
+                <w:bCs w:val="false"/>
+                <w:sz w:val="20"/>
+                <w:szCs w:val="20"/>
+              </w:rPr>
+              <w:t>28/10/2026</w:t>
+            </w:r>
+          </w:p>
+        </w:tc>
+        <w:tc>
+          <w:tcPr>
+            <w:tcW w:type="dxa" w:w="7326"/>
+            <w:tcBorders>
+              <w:top w:val="single" w:color="A6A6A6" w:sz="4"/>
+              <w:left w:val="single" w:color="A6A6A6" w:sz="4"/>
+              <w:bottom w:val="single" w:color="A6A6A6" w:sz="4"/>
+              <w:right w:val="single" w:color="A6A6A6" w:sz="4"/>
+            </w:tcBorders>
+            <w:shd w:fill="DCE9F5" w:color="auto" w:val="clear"/>
+            <w:tcMar>
+              <w:top w:type="dxa" w:w="60"/>
+              <w:left w:type="dxa" w:w="100"/>
+              <w:bottom w:type="dxa" w:w="60"/>
+              <w:right w:type="dxa" w:w="100"/>
+            </w:tcMar>
+          </w:tcPr>
+          <w:p>
+            <w:r>
+              <w:rPr>
+                <w:b w:val="false"/>
+                <w:bCs w:val="false"/>
+                <w:sz w:val="20"/>
+                <w:szCs w:val="20"/>
+              </w:rPr>
+              <w:t>B5 aprobado: horarios y disponibilidad en la rama feature/horarios-disponibilidad. Migración V6 (tabla ajuste_horario y día de cierre único); ajuste por empleado día a día; guardar un horario o un día de cierre con citas afectadas se permite y la respuesta las lista; horas alineadas al reloj; el ajuste de un empleado puede salirse del horario general; datos de demo con DEMO_PASSWORD.</w:t>
             </w:r>
           </w:p>
         </w:tc>

</xml_diff>

<commit_message>
docs: propuesta del B6 y guía para probar las reservas
Co-Authored-By: Claude Opus 5.5 <noreply@anthropic.com>
Claude-Session: https://claude.ai/code/session_0172dfumXBTUge1msmvL8taF
</commit_message>
<xml_diff>
--- a/docs/Doc.docx
+++ b/docs/Doc.docx
@@ -28960,7 +28960,7 @@
                 <w:sz w:val="20"/>
                 <w:szCs w:val="20"/>
               </w:rPr>
-              <w:t>Horario general, ajuste por empleado día a día (tabla ajuste_horario, migración V6) y días de cierre del negocio o de un empleado; al guardarlos se listan las citas afectadas sin cancelarlas. GET /disponibilidad público con el cálculo en CalculoDisponibilidad (sin Spring) y sugerencia del siguiente día con huecos. Datos de demostración en el perfil demo con DEMO_PASSWORD. Hecho (detalle en propuestas/4.5-B5-horarios-disponibilidad.md). B6 sustituirá la consulta provisional OcupacionesProfesionalJdbc.</w:t>
+              <w:t>Horario general, ajuste por empleado día a día (tabla ajuste_horario, migración V6) y días de cierre del negocio o de un empleado; al guardarlos se listan las citas afectadas sin cancelarlas. GET /disponibilidad público con el cálculo en CalculoDisponibilidad (sin Spring) y sugerencia del siguiente día con huecos. Datos de demostración en el perfil demo con DEMO_PASSWORD. Hecho (detalle en propuestas/4.5-B5-horarios-disponibilidad.md).</w:t>
             </w:r>
           </w:p>
         </w:tc>
@@ -29018,7 +29018,7 @@
                 <w:sz w:val="20"/>
                 <w:szCs w:val="20"/>
               </w:rPr>
-              <w:t>Beneficiarios, reservar (409 si hay solape), mis citas, cancelar con plazo de 24 h, agenda del empleado y gestión de reservas.</w:t>
+              <w:t>En dos PR. B6a (feature/citas, cliente): beneficiarios anonimizables (migración V7), reservar volviendo a comprobar la disponibilidad (409 si el hueco ya no está libre, también con dos reservas a la vez), mis citas paginadas, detalle por rol y cancelar con plazo de 24 h; además sustituye las consultas provisionales de B4 y B5 y añade beneficiarios y citas a la exportación y al borrado de la cuenta. Hecho. B6b (feature/citas-gestion): agenda y estados del empleado, gestión de reservas y búsqueda de clientes del administrador. Pendiente (detalle en propuestas/4.6-B6-citas.md).</w:t>
             </w:r>
           </w:p>
         </w:tc>
@@ -31542,6 +31542,126 @@
                 <w:szCs w:val="20"/>
               </w:rPr>
               <w:t>B5 aprobado: horarios y disponibilidad en la rama feature/horarios-disponibilidad. Migración V6 (tabla ajuste_horario y día de cierre único); ajuste por empleado día a día; guardar un horario o un día de cierre con citas afectadas se permite y la respuesta las lista; horas alineadas al reloj; el ajuste de un empleado puede salirse del horario general; datos de demo con DEMO_PASSWORD.</w:t>
+            </w:r>
+          </w:p>
+        </w:tc>
+      </w:tr>
+      <w:tr>
+        <w:tc>
+          <w:tcPr>
+            <w:tcW w:type="dxa" w:w="1700"/>
+            <w:tcBorders>
+              <w:top w:val="single" w:color="A6A6A6" w:sz="4"/>
+              <w:left w:val="single" w:color="A6A6A6" w:sz="4"/>
+              <w:bottom w:val="single" w:color="A6A6A6" w:sz="4"/>
+              <w:right w:val="single" w:color="A6A6A6" w:sz="4"/>
+            </w:tcBorders>
+            <w:shd w:fill="DCE9F5" w:color="auto" w:val="clear"/>
+            <w:tcMar>
+              <w:top w:type="dxa" w:w="60"/>
+              <w:left w:type="dxa" w:w="100"/>
+              <w:bottom w:type="dxa" w:w="60"/>
+              <w:right w:type="dxa" w:w="100"/>
+            </w:tcMar>
+          </w:tcPr>
+          <w:p>
+            <w:r>
+              <w:rPr>
+                <w:b w:val="false"/>
+                <w:bCs w:val="false"/>
+                <w:sz w:val="20"/>
+                <w:szCs w:val="20"/>
+              </w:rPr>
+              <w:t>28/10/2026</w:t>
+            </w:r>
+          </w:p>
+        </w:tc>
+        <w:tc>
+          <w:tcPr>
+            <w:tcW w:type="dxa" w:w="7326"/>
+            <w:tcBorders>
+              <w:top w:val="single" w:color="A6A6A6" w:sz="4"/>
+              <w:left w:val="single" w:color="A6A6A6" w:sz="4"/>
+              <w:bottom w:val="single" w:color="A6A6A6" w:sz="4"/>
+              <w:right w:val="single" w:color="A6A6A6" w:sz="4"/>
+            </w:tcBorders>
+            <w:shd w:fill="DCE9F5" w:color="auto" w:val="clear"/>
+            <w:tcMar>
+              <w:top w:type="dxa" w:w="60"/>
+              <w:left w:type="dxa" w:w="100"/>
+              <w:bottom w:type="dxa" w:w="60"/>
+              <w:right w:type="dxa" w:w="100"/>
+            </w:tcMar>
+          </w:tcPr>
+          <w:p>
+            <w:r>
+              <w:rPr>
+                <w:b w:val="false"/>
+                <w:bCs w:val="false"/>
+                <w:sz w:val="20"/>
+                <w:szCs w:val="20"/>
+              </w:rPr>
+              <w:t>B5 fusionado (PR #6).</w:t>
+            </w:r>
+          </w:p>
+        </w:tc>
+      </w:tr>
+      <w:tr>
+        <w:tc>
+          <w:tcPr>
+            <w:tcW w:type="dxa" w:w="1700"/>
+            <w:tcBorders>
+              <w:top w:val="single" w:color="A6A6A6" w:sz="4"/>
+              <w:left w:val="single" w:color="A6A6A6" w:sz="4"/>
+              <w:bottom w:val="single" w:color="A6A6A6" w:sz="4"/>
+              <w:right w:val="single" w:color="A6A6A6" w:sz="4"/>
+            </w:tcBorders>
+            <w:shd w:fill="DCE9F5" w:color="auto" w:val="clear"/>
+            <w:tcMar>
+              <w:top w:type="dxa" w:w="60"/>
+              <w:left w:type="dxa" w:w="100"/>
+              <w:bottom w:type="dxa" w:w="60"/>
+              <w:right w:type="dxa" w:w="100"/>
+            </w:tcMar>
+          </w:tcPr>
+          <w:p>
+            <w:r>
+              <w:rPr>
+                <w:b w:val="false"/>
+                <w:bCs w:val="false"/>
+                <w:sz w:val="20"/>
+                <w:szCs w:val="20"/>
+              </w:rPr>
+              <w:t>28/10/2026</w:t>
+            </w:r>
+          </w:p>
+        </w:tc>
+        <w:tc>
+          <w:tcPr>
+            <w:tcW w:type="dxa" w:w="7326"/>
+            <w:tcBorders>
+              <w:top w:val="single" w:color="A6A6A6" w:sz="4"/>
+              <w:left w:val="single" w:color="A6A6A6" w:sz="4"/>
+              <w:bottom w:val="single" w:color="A6A6A6" w:sz="4"/>
+              <w:right w:val="single" w:color="A6A6A6" w:sz="4"/>
+            </w:tcBorders>
+            <w:shd w:fill="DCE9F5" w:color="auto" w:val="clear"/>
+            <w:tcMar>
+              <w:top w:type="dxa" w:w="60"/>
+              <w:left w:type="dxa" w:w="100"/>
+              <w:bottom w:type="dxa" w:w="60"/>
+              <w:right w:type="dxa" w:w="100"/>
+            </w:tcMar>
+          </w:tcPr>
+          <w:p>
+            <w:r>
+              <w:rPr>
+                <w:b w:val="false"/>
+                <w:bCs w:val="false"/>
+                <w:sz w:val="20"/>
+                <w:szCs w:val="20"/>
+              </w:rPr>
+              <w:t>B6 aprobado: citas en dos PR (feature/citas para el cliente y feature/citas-gestion para el empleado y el administrador). Migración V7 (beneficiario anonimizable); al reservar se vuelve a comprobar la disponibilidad (409); el administrador cancela con PATCH /citas/{id}/estado; nuevo GET /admin/clientes?buscar=; una misma persona no tiene dos citas solapadas; la edad del menor se compara con edadMinimaCuenta; "Mis citas" incluye las canceladas futuras.</w:t>
             </w:r>
           </w:p>
         </w:tc>

</xml_diff>

<commit_message>
docs: B6 terminado y guía para probar la agenda y la gestión de reservas
Co-Authored-By: Claude Opus 5.5 <noreply@anthropic.com>
Claude-Session: https://claude.ai/code/session_0172dfumXBTUge1msmvL8taF
</commit_message>
<xml_diff>
--- a/docs/Doc.docx
+++ b/docs/Doc.docx
@@ -29018,7 +29018,7 @@
                 <w:sz w:val="20"/>
                 <w:szCs w:val="20"/>
               </w:rPr>
-              <w:t>En dos PR. B6a (feature/citas, cliente): beneficiarios anonimizables (migración V7), reservar volviendo a comprobar la disponibilidad (409 si el hueco ya no está libre, también con dos reservas a la vez), mis citas paginadas, detalle por rol y cancelar con plazo de 24 h; además sustituye las consultas provisionales de B4 y B5 y añade beneficiarios y citas a la exportación y al borrado de la cuenta. Hecho. B6b (feature/citas-gestion): agenda y estados del empleado, gestión de reservas y búsqueda de clientes del administrador. Pendiente (detalle en propuestas/4.6-B6-citas.md).</w:t>
+              <w:t>En dos PR. B6a (feature/citas, cliente): beneficiarios anonimizables (migración V7), reservar volviendo a comprobar la disponibilidad (409 si el hueco ya no está libre, también con dos reservas a la vez), mis citas paginadas, detalle por rol y cancelar con plazo de 24 h; además sustituye las consultas provisionales de B4 y B5 y añade beneficiarios y citas a la exportación y al borrado de la cuenta. Hecho. B6b (feature/citas-gestion, empleado y administrador): agenda por días con horario, cierres y citas; lista de citas con filtros; cambio de estado con las transiciones de RN-008 y motivo al cancelar; reservas del administrador con filtros, reserva en nombre de un cliente y búsqueda de clientes. Hecho (detalle en propuestas/4.6-B6-citas.md). Con el B6 termina el backend.</w:t>
             </w:r>
           </w:p>
         </w:tc>
@@ -31662,6 +31662,66 @@
                 <w:szCs w:val="20"/>
               </w:rPr>
               <w:t>B6 aprobado: citas en dos PR (feature/citas para el cliente y feature/citas-gestion para el empleado y el administrador). Migración V7 (beneficiario anonimizable); al reservar se vuelve a comprobar la disponibilidad (409); el administrador cancela con PATCH /citas/{id}/estado; nuevo GET /admin/clientes?buscar=; una misma persona no tiene dos citas solapadas; la edad del menor se compara con edadMinimaCuenta; "Mis citas" incluye las canceladas futuras.</w:t>
+            </w:r>
+          </w:p>
+        </w:tc>
+      </w:tr>
+      <w:tr>
+        <w:tc>
+          <w:tcPr>
+            <w:tcW w:type="dxa" w:w="1700"/>
+            <w:tcBorders>
+              <w:top w:val="single" w:color="A6A6A6" w:sz="4"/>
+              <w:left w:val="single" w:color="A6A6A6" w:sz="4"/>
+              <w:bottom w:val="single" w:color="A6A6A6" w:sz="4"/>
+              <w:right w:val="single" w:color="A6A6A6" w:sz="4"/>
+            </w:tcBorders>
+            <w:shd w:fill="DCE9F5" w:color="auto" w:val="clear"/>
+            <w:tcMar>
+              <w:top w:type="dxa" w:w="60"/>
+              <w:left w:type="dxa" w:w="100"/>
+              <w:bottom w:type="dxa" w:w="60"/>
+              <w:right w:type="dxa" w:w="100"/>
+            </w:tcMar>
+          </w:tcPr>
+          <w:p>
+            <w:r>
+              <w:rPr>
+                <w:b w:val="false"/>
+                <w:bCs w:val="false"/>
+                <w:sz w:val="20"/>
+                <w:szCs w:val="20"/>
+              </w:rPr>
+              <w:t>28/10/2026</w:t>
+            </w:r>
+          </w:p>
+        </w:tc>
+        <w:tc>
+          <w:tcPr>
+            <w:tcW w:type="dxa" w:w="7326"/>
+            <w:tcBorders>
+              <w:top w:val="single" w:color="A6A6A6" w:sz="4"/>
+              <w:left w:val="single" w:color="A6A6A6" w:sz="4"/>
+              <w:bottom w:val="single" w:color="A6A6A6" w:sz="4"/>
+              <w:right w:val="single" w:color="A6A6A6" w:sz="4"/>
+            </w:tcBorders>
+            <w:shd w:fill="DCE9F5" w:color="auto" w:val="clear"/>
+            <w:tcMar>
+              <w:top w:type="dxa" w:w="60"/>
+              <w:left w:type="dxa" w:w="100"/>
+              <w:bottom w:type="dxa" w:w="60"/>
+              <w:right w:type="dxa" w:w="100"/>
+            </w:tcMar>
+          </w:tcPr>
+          <w:p>
+            <w:r>
+              <w:rPr>
+                <w:b w:val="false"/>
+                <w:bCs w:val="false"/>
+                <w:sz w:val="20"/>
+                <w:szCs w:val="20"/>
+              </w:rPr>
+              <w:t>B6a fusionado (PR #7).</w:t>
             </w:r>
           </w:p>
         </w:tc>

</xml_diff>

<commit_message>
docs: propuesta del B7 y guía para arrancar y probar la web
Co-Authored-By: Claude Opus 5.5 <noreply@anthropic.com>
Claude-Session: https://claude.ai/code/session_0172dfukxLGGnnskpsEr6Q8y
</commit_message>
<xml_diff>
--- a/docs/Doc.docx
+++ b/docs/Doc.docx
@@ -6529,7 +6529,7 @@
                 <w:sz w:val="20"/>
                 <w:szCs w:val="20"/>
               </w:rPr>
-              <w:t xml:space="preserve">React + TypeScript con Vite, React Router, TanStack Query, React Hook Form + Zod.</w:t>
+              <w:t>React 19 + TypeScript 7 con Vite 8, React Router, TanStack Query, React Hook Form + Zod y CSS Modules (sin Tailwind ni librerías de componentes).</w:t>
             </w:r>
           </w:p>
         </w:tc>
@@ -6587,7 +6587,7 @@
                 <w:sz w:val="20"/>
                 <w:szCs w:val="20"/>
               </w:rPr>
-              <w:t xml:space="preserve">Vitest y Testing Library.</w:t>
+              <w:t>Vitest, Testing Library y MSW (API simulada, sin backend); lint con oxlint.</w:t>
             </w:r>
           </w:p>
         </w:tc>
@@ -29076,7 +29076,7 @@
                 <w:sz w:val="20"/>
                 <w:szCs w:val="20"/>
               </w:rPr>
-              <w:t>Vite + React + TypeScript, cliente de la API, login, registro, catálogo y horarios libres; CI del frontend.</w:t>
+              <w:t>Proyecto frontend/ con Vite 8, React 19 y TypeScript 7 estricto; React Router, TanStack Query, React Hook Form + Zod y CSS Modules con variables (móvil primero y modo oscuro). Cliente de la API con el access token solo en memoria, recuperación de la sesión con la cookie al abrir la web y renovación automática con un solo refresh a la vez (también entre pestañas, con Web Locks). Rutas por rol y cambio obligatorio de la contraseña temporal (RN-005). Pantallas de inicio, servicios, profesionales, horas libres, registro, login y política de privacidad provisional. Nuevo GET /negocio público. Pruebas con Vitest, Testing Library y MSW; job de CI del frontend con oxlint, tipos, pruebas y compilación. Hecho (detalle en propuestas/4.7-B7-web-base.md).</w:t>
             </w:r>
           </w:p>
         </w:tc>
@@ -31722,6 +31722,126 @@
                 <w:szCs w:val="20"/>
               </w:rPr>
               <w:t>B6a fusionado (PR #7).</w:t>
+            </w:r>
+          </w:p>
+        </w:tc>
+      </w:tr>
+      <w:tr>
+        <w:tc>
+          <w:tcPr>
+            <w:tcW w:type="dxa" w:w="1700"/>
+            <w:tcBorders>
+              <w:top w:val="single" w:color="A6A6A6" w:sz="4"/>
+              <w:left w:val="single" w:color="A6A6A6" w:sz="4"/>
+              <w:bottom w:val="single" w:color="A6A6A6" w:sz="4"/>
+              <w:right w:val="single" w:color="A6A6A6" w:sz="4"/>
+            </w:tcBorders>
+            <w:shd w:fill="DCE9F5" w:color="auto" w:val="clear"/>
+            <w:tcMar>
+              <w:top w:type="dxa" w:w="60"/>
+              <w:left w:type="dxa" w:w="100"/>
+              <w:bottom w:type="dxa" w:w="60"/>
+              <w:right w:type="dxa" w:w="100"/>
+            </w:tcMar>
+          </w:tcPr>
+          <w:p>
+            <w:r>
+              <w:rPr>
+                <w:b w:val="false"/>
+                <w:bCs w:val="false"/>
+                <w:sz w:val="20"/>
+                <w:szCs w:val="20"/>
+              </w:rPr>
+              <w:t>28/10/2026</w:t>
+            </w:r>
+          </w:p>
+        </w:tc>
+        <w:tc>
+          <w:tcPr>
+            <w:tcW w:type="dxa" w:w="7326"/>
+            <w:tcBorders>
+              <w:top w:val="single" w:color="A6A6A6" w:sz="4"/>
+              <w:left w:val="single" w:color="A6A6A6" w:sz="4"/>
+              <w:bottom w:val="single" w:color="A6A6A6" w:sz="4"/>
+              <w:right w:val="single" w:color="A6A6A6" w:sz="4"/>
+            </w:tcBorders>
+            <w:shd w:fill="DCE9F5" w:color="auto" w:val="clear"/>
+            <w:tcMar>
+              <w:top w:type="dxa" w:w="60"/>
+              <w:left w:type="dxa" w:w="100"/>
+              <w:bottom w:type="dxa" w:w="60"/>
+              <w:right w:type="dxa" w:w="100"/>
+            </w:tcMar>
+          </w:tcPr>
+          <w:p>
+            <w:r>
+              <w:rPr>
+                <w:b w:val="false"/>
+                <w:bCs w:val="false"/>
+                <w:sz w:val="20"/>
+                <w:szCs w:val="20"/>
+              </w:rPr>
+              <w:t>B6b fusionado (PR #8). Backend completo (B1 a B6).</w:t>
+            </w:r>
+          </w:p>
+        </w:tc>
+      </w:tr>
+      <w:tr>
+        <w:tc>
+          <w:tcPr>
+            <w:tcW w:type="dxa" w:w="1700"/>
+            <w:tcBorders>
+              <w:top w:val="single" w:color="A6A6A6" w:sz="4"/>
+              <w:left w:val="single" w:color="A6A6A6" w:sz="4"/>
+              <w:bottom w:val="single" w:color="A6A6A6" w:sz="4"/>
+              <w:right w:val="single" w:color="A6A6A6" w:sz="4"/>
+            </w:tcBorders>
+            <w:shd w:fill="DCE9F5" w:color="auto" w:val="clear"/>
+            <w:tcMar>
+              <w:top w:type="dxa" w:w="60"/>
+              <w:left w:type="dxa" w:w="100"/>
+              <w:bottom w:type="dxa" w:w="60"/>
+              <w:right w:type="dxa" w:w="100"/>
+            </w:tcMar>
+          </w:tcPr>
+          <w:p>
+            <w:r>
+              <w:rPr>
+                <w:b w:val="false"/>
+                <w:bCs w:val="false"/>
+                <w:sz w:val="20"/>
+                <w:szCs w:val="20"/>
+              </w:rPr>
+              <w:t>31/10/2026</w:t>
+            </w:r>
+          </w:p>
+        </w:tc>
+        <w:tc>
+          <w:tcPr>
+            <w:tcW w:type="dxa" w:w="7326"/>
+            <w:tcBorders>
+              <w:top w:val="single" w:color="A6A6A6" w:sz="4"/>
+              <w:left w:val="single" w:color="A6A6A6" w:sz="4"/>
+              <w:bottom w:val="single" w:color="A6A6A6" w:sz="4"/>
+              <w:right w:val="single" w:color="A6A6A6" w:sz="4"/>
+            </w:tcBorders>
+            <w:shd w:fill="DCE9F5" w:color="auto" w:val="clear"/>
+            <w:tcMar>
+              <w:top w:type="dxa" w:w="60"/>
+              <w:left w:type="dxa" w:w="100"/>
+              <w:bottom w:type="dxa" w:w="60"/>
+              <w:right w:type="dxa" w:w="100"/>
+            </w:tcMar>
+          </w:tcPr>
+          <w:p>
+            <w:r>
+              <w:rPr>
+                <w:b w:val="false"/>
+                <w:bCs w:val="false"/>
+                <w:sz w:val="20"/>
+                <w:szCs w:val="20"/>
+              </w:rPr>
+              <w:t>B7 aprobado: web base y zona pública en feature/web-base. Nuevo GET /negocio público; proxy de Vite en desarrollo; CSS Modules sin Tailwind; cambio de la contraseña temporal ya en el B7 (RN-005); política de privacidad provisional; recuperar contraseña (CU-020) se queda en el B8. TypeScript 7 y oxlint (los de la plantilla actual de Vite) en lugar de ESLint, que aún no admite TypeScript 7.</w:t>
             </w:r>
           </w:p>
         </w:tc>

</xml_diff>

<commit_message>
docs: propuesta del B8 y guía para probar la zona del cliente
Co-Authored-By: Claude Opus 5.5 <noreply@anthropic.com>
Claude-Session: https://claude.ai/code/session_0172dfumAv4H25UDRaH2DjGc
</commit_message>
<xml_diff>
--- a/docs/Doc.docx
+++ b/docs/Doc.docx
@@ -29134,7 +29134,7 @@
                 <w:sz w:val="20"/>
                 <w:szCs w:val="20"/>
               </w:rPr>
-              <w:t>Reservar (también para un menor), mis citas, cancelar, perfil y RGPD.</w:t>
+              <w:t>En dos PR. B8a (feature/web-cliente): cada hora libre lleva a reservar (el visitante pasa antes por el login); reservar para sí o para un menor a cargo, con la hora enviada con el desfase de la zona del negocio calculado en la web; 409 con "Elegir otra hora"; mis citas próximas e historial con "Ver más"; detalle y cancelar con confirmación en la página según puedeCancelar del servidor (RN-004); menores a cargo (añadir, corregir y eliminar). Hecho. B8b (feature/web-cliente-perfil): perfil para los tres roles, exportar los datos, eliminar la cuenta (solo cliente) y recuperar la contraseña (detalle en propuestas/4.8-B8-web-cliente.md).</w:t>
             </w:r>
           </w:p>
         </w:tc>
@@ -31842,6 +31842,126 @@
                 <w:szCs w:val="20"/>
               </w:rPr>
               <w:t>B7 aprobado: web base y zona pública en feature/web-base. Nuevo GET /negocio público; proxy de Vite en desarrollo; CSS Modules sin Tailwind; cambio de la contraseña temporal ya en el B7 (RN-005); política de privacidad provisional; recuperar contraseña (CU-020) se queda en el B8. TypeScript 7 y oxlint (los de la plantilla actual de Vite) en lugar de ESLint, que aún no admite TypeScript 7.</w:t>
+            </w:r>
+          </w:p>
+        </w:tc>
+      </w:tr>
+      <w:tr>
+        <w:tc>
+          <w:tcPr>
+            <w:tcW w:type="dxa" w:w="1700"/>
+            <w:tcBorders>
+              <w:top w:val="single" w:color="A6A6A6" w:sz="4"/>
+              <w:left w:val="single" w:color="A6A6A6" w:sz="4"/>
+              <w:bottom w:val="single" w:color="A6A6A6" w:sz="4"/>
+              <w:right w:val="single" w:color="A6A6A6" w:sz="4"/>
+            </w:tcBorders>
+            <w:shd w:fill="DCE9F5" w:color="auto" w:val="clear"/>
+            <w:tcMar>
+              <w:top w:type="dxa" w:w="60"/>
+              <w:left w:type="dxa" w:w="100"/>
+              <w:bottom w:type="dxa" w:w="60"/>
+              <w:right w:type="dxa" w:w="100"/>
+            </w:tcMar>
+          </w:tcPr>
+          <w:p>
+            <w:r>
+              <w:rPr>
+                <w:b w:val="false"/>
+                <w:bCs w:val="false"/>
+                <w:sz w:val="20"/>
+                <w:szCs w:val="20"/>
+              </w:rPr>
+              <w:t>31/10/2026</w:t>
+            </w:r>
+          </w:p>
+        </w:tc>
+        <w:tc>
+          <w:tcPr>
+            <w:tcW w:type="dxa" w:w="7326"/>
+            <w:tcBorders>
+              <w:top w:val="single" w:color="A6A6A6" w:sz="4"/>
+              <w:left w:val="single" w:color="A6A6A6" w:sz="4"/>
+              <w:bottom w:val="single" w:color="A6A6A6" w:sz="4"/>
+              <w:right w:val="single" w:color="A6A6A6" w:sz="4"/>
+            </w:tcBorders>
+            <w:shd w:fill="DCE9F5" w:color="auto" w:val="clear"/>
+            <w:tcMar>
+              <w:top w:type="dxa" w:w="60"/>
+              <w:left w:type="dxa" w:w="100"/>
+              <w:bottom w:type="dxa" w:w="60"/>
+              <w:right w:type="dxa" w:w="100"/>
+            </w:tcMar>
+          </w:tcPr>
+          <w:p>
+            <w:r>
+              <w:rPr>
+                <w:b w:val="false"/>
+                <w:bCs w:val="false"/>
+                <w:sz w:val="20"/>
+                <w:szCs w:val="20"/>
+              </w:rPr>
+              <w:t>B7 fusionado (PR #9).</w:t>
+            </w:r>
+          </w:p>
+        </w:tc>
+      </w:tr>
+      <w:tr>
+        <w:tc>
+          <w:tcPr>
+            <w:tcW w:type="dxa" w:w="1700"/>
+            <w:tcBorders>
+              <w:top w:val="single" w:color="A6A6A6" w:sz="4"/>
+              <w:left w:val="single" w:color="A6A6A6" w:sz="4"/>
+              <w:bottom w:val="single" w:color="A6A6A6" w:sz="4"/>
+              <w:right w:val="single" w:color="A6A6A6" w:sz="4"/>
+            </w:tcBorders>
+            <w:shd w:fill="DCE9F5" w:color="auto" w:val="clear"/>
+            <w:tcMar>
+              <w:top w:type="dxa" w:w="60"/>
+              <w:left w:type="dxa" w:w="100"/>
+              <w:bottom w:type="dxa" w:w="60"/>
+              <w:right w:type="dxa" w:w="100"/>
+            </w:tcMar>
+          </w:tcPr>
+          <w:p>
+            <w:r>
+              <w:rPr>
+                <w:b w:val="false"/>
+                <w:bCs w:val="false"/>
+                <w:sz w:val="20"/>
+                <w:szCs w:val="20"/>
+              </w:rPr>
+              <w:t>31/10/2026</w:t>
+            </w:r>
+          </w:p>
+        </w:tc>
+        <w:tc>
+          <w:tcPr>
+            <w:tcW w:type="dxa" w:w="7326"/>
+            <w:tcBorders>
+              <w:top w:val="single" w:color="A6A6A6" w:sz="4"/>
+              <w:left w:val="single" w:color="A6A6A6" w:sz="4"/>
+              <w:bottom w:val="single" w:color="A6A6A6" w:sz="4"/>
+              <w:right w:val="single" w:color="A6A6A6" w:sz="4"/>
+            </w:tcBorders>
+            <w:shd w:fill="DCE9F5" w:color="auto" w:val="clear"/>
+            <w:tcMar>
+              <w:top w:type="dxa" w:w="60"/>
+              <w:left w:type="dxa" w:w="100"/>
+              <w:bottom w:type="dxa" w:w="60"/>
+              <w:right w:type="dxa" w:w="100"/>
+            </w:tcMar>
+          </w:tcPr>
+          <w:p>
+            <w:r>
+              <w:rPr>
+                <w:b w:val="false"/>
+                <w:bCs w:val="false"/>
+                <w:sz w:val="20"/>
+                <w:szCs w:val="20"/>
+              </w:rPr>
+              <w:t>B8 aprobado: zona del cliente en dos PR (feature/web-cliente y feature/web-cliente-perfil). Sin cambios en el backend: la web calcula el desfase de la hora reservada con Intl; /perfil para los tres roles con "Eliminar mi cuenta" solo para el cliente; menores con página propia y también desde la reserva; confirmaciones dentro de la página en lugar de ventanas emergentes.</w:t>
             </w:r>
           </w:p>
         </w:tc>

</xml_diff>

<commit_message>
docs: B8a fusionado (PR #10)
Co-Authored-By: Claude Opus 5.5 <noreply@anthropic.com>
Claude-Session: https://claude.ai/code/session_0172dfumAv4H25UDRaH2DjGc
</commit_message>
<xml_diff>
--- a/docs/Doc.docx
+++ b/docs/Doc.docx
@@ -31966,6 +31966,66 @@
           </w:p>
         </w:tc>
       </w:tr>
+      <w:tr>
+        <w:tc>
+          <w:tcPr>
+            <w:tcW w:type="dxa" w:w="1700"/>
+            <w:tcBorders>
+              <w:top w:val="single" w:color="A6A6A6" w:sz="4"/>
+              <w:left w:val="single" w:color="A6A6A6" w:sz="4"/>
+              <w:bottom w:val="single" w:color="A6A6A6" w:sz="4"/>
+              <w:right w:val="single" w:color="A6A6A6" w:sz="4"/>
+            </w:tcBorders>
+            <w:shd w:fill="DCE9F5" w:color="auto" w:val="clear"/>
+            <w:tcMar>
+              <w:top w:type="dxa" w:w="60"/>
+              <w:left w:type="dxa" w:w="100"/>
+              <w:bottom w:type="dxa" w:w="60"/>
+              <w:right w:type="dxa" w:w="100"/>
+            </w:tcMar>
+          </w:tcPr>
+          <w:p>
+            <w:r>
+              <w:rPr>
+                <w:b w:val="false"/>
+                <w:bCs w:val="false"/>
+                <w:sz w:val="20"/>
+                <w:szCs w:val="20"/>
+              </w:rPr>
+              <w:t>31/10/2026</w:t>
+            </w:r>
+          </w:p>
+        </w:tc>
+        <w:tc>
+          <w:tcPr>
+            <w:tcW w:type="dxa" w:w="7326"/>
+            <w:tcBorders>
+              <w:top w:val="single" w:color="A6A6A6" w:sz="4"/>
+              <w:left w:val="single" w:color="A6A6A6" w:sz="4"/>
+              <w:bottom w:val="single" w:color="A6A6A6" w:sz="4"/>
+              <w:right w:val="single" w:color="A6A6A6" w:sz="4"/>
+            </w:tcBorders>
+            <w:shd w:fill="DCE9F5" w:color="auto" w:val="clear"/>
+            <w:tcMar>
+              <w:top w:type="dxa" w:w="60"/>
+              <w:left w:type="dxa" w:w="100"/>
+              <w:bottom w:type="dxa" w:w="60"/>
+              <w:right w:type="dxa" w:w="100"/>
+            </w:tcMar>
+          </w:tcPr>
+          <w:p>
+            <w:r>
+              <w:rPr>
+                <w:b w:val="false"/>
+                <w:bCs w:val="false"/>
+                <w:sz w:val="20"/>
+                <w:szCs w:val="20"/>
+              </w:rPr>
+              <w:t>B8a fusionado (PR #10).</w:t>
+            </w:r>
+          </w:p>
+        </w:tc>
+      </w:tr>
     </w:tbl>
     <w:sectPr>
       <w:pgSz w:w="11906" w:h="16838" w:orient="portrait"/>

</xml_diff>

<commit_message>
docs: propuesta del B9, guía de la zona del empleado y B8b fusionado (PR #11)
Co-Authored-By: Claude Opus 5.5 <noreply@anthropic.com>
Claude-Session: https://claude.ai/code/session_0172dfujCw3mMf6MY86dn9Fv
</commit_message>
<xml_diff>
--- a/docs/Doc.docx
+++ b/docs/Doc.docx
@@ -29192,7 +29192,7 @@
                 <w:sz w:val="20"/>
                 <w:szCs w:val="20"/>
               </w:rPr>
-              <w:t>Agenda del empleado y panel del administrador.</w:t>
+              <w:t>En tres PR. B9a (feature/web-empleado): agenda semanal del empleado con su horario, días de cierre y citas; citas asignadas con filtros; detalle con el teléfono del cliente y cambio de estado (Completada y No presentado desde la hora de inicio, Cancelar con motivo obligatorio); mis servicios. Hecho. B9b (feature/web-admin-reservas): reservas con filtros, detalle con historial y reservar por un cliente desde los horarios libres. B9c (feature/web-admin-gestion): servicios, empleados, horarios, días de cierre y configuración del negocio (detalle en propuestas/4.9-B9-web-empleado-admin.md).</w:t>
             </w:r>
           </w:p>
         </w:tc>
@@ -32022,6 +32022,126 @@
                 <w:szCs w:val="20"/>
               </w:rPr>
               <w:t>B8a fusionado (PR #10).</w:t>
+            </w:r>
+          </w:p>
+        </w:tc>
+      </w:tr>
+      <w:tr>
+        <w:tc>
+          <w:tcPr>
+            <w:tcW w:type="dxa" w:w="1700"/>
+            <w:tcBorders>
+              <w:top w:val="single" w:color="A6A6A6" w:sz="4"/>
+              <w:left w:val="single" w:color="A6A6A6" w:sz="4"/>
+              <w:bottom w:val="single" w:color="A6A6A6" w:sz="4"/>
+              <w:right w:val="single" w:color="A6A6A6" w:sz="4"/>
+            </w:tcBorders>
+            <w:shd w:fill="DCE9F5" w:color="auto" w:val="clear"/>
+            <w:tcMar>
+              <w:top w:type="dxa" w:w="60"/>
+              <w:left w:type="dxa" w:w="100"/>
+              <w:bottom w:type="dxa" w:w="60"/>
+              <w:right w:type="dxa" w:w="100"/>
+            </w:tcMar>
+          </w:tcPr>
+          <w:p>
+            <w:r>
+              <w:rPr>
+                <w:b w:val="false"/>
+                <w:bCs w:val="false"/>
+                <w:sz w:val="20"/>
+                <w:szCs w:val="20"/>
+              </w:rPr>
+              <w:t>31/10/2026</w:t>
+            </w:r>
+          </w:p>
+        </w:tc>
+        <w:tc>
+          <w:tcPr>
+            <w:tcW w:type="dxa" w:w="7326"/>
+            <w:tcBorders>
+              <w:top w:val="single" w:color="A6A6A6" w:sz="4"/>
+              <w:left w:val="single" w:color="A6A6A6" w:sz="4"/>
+              <w:bottom w:val="single" w:color="A6A6A6" w:sz="4"/>
+              <w:right w:val="single" w:color="A6A6A6" w:sz="4"/>
+            </w:tcBorders>
+            <w:shd w:fill="DCE9F5" w:color="auto" w:val="clear"/>
+            <w:tcMar>
+              <w:top w:type="dxa" w:w="60"/>
+              <w:left w:type="dxa" w:w="100"/>
+              <w:bottom w:type="dxa" w:w="60"/>
+              <w:right w:type="dxa" w:w="100"/>
+            </w:tcMar>
+          </w:tcPr>
+          <w:p>
+            <w:r>
+              <w:rPr>
+                <w:b w:val="false"/>
+                <w:bCs w:val="false"/>
+                <w:sz w:val="20"/>
+                <w:szCs w:val="20"/>
+              </w:rPr>
+              <w:t>B8b fusionado (PR #11).</w:t>
+            </w:r>
+          </w:p>
+        </w:tc>
+      </w:tr>
+      <w:tr>
+        <w:tc>
+          <w:tcPr>
+            <w:tcW w:type="dxa" w:w="1700"/>
+            <w:tcBorders>
+              <w:top w:val="single" w:color="A6A6A6" w:sz="4"/>
+              <w:left w:val="single" w:color="A6A6A6" w:sz="4"/>
+              <w:bottom w:val="single" w:color="A6A6A6" w:sz="4"/>
+              <w:right w:val="single" w:color="A6A6A6" w:sz="4"/>
+            </w:tcBorders>
+            <w:shd w:fill="DCE9F5" w:color="auto" w:val="clear"/>
+            <w:tcMar>
+              <w:top w:type="dxa" w:w="60"/>
+              <w:left w:type="dxa" w:w="100"/>
+              <w:bottom w:type="dxa" w:w="60"/>
+              <w:right w:type="dxa" w:w="100"/>
+            </w:tcMar>
+          </w:tcPr>
+          <w:p>
+            <w:r>
+              <w:rPr>
+                <w:b w:val="false"/>
+                <w:bCs w:val="false"/>
+                <w:sz w:val="20"/>
+                <w:szCs w:val="20"/>
+              </w:rPr>
+              <w:t>31/10/2026</w:t>
+            </w:r>
+          </w:p>
+        </w:tc>
+        <w:tc>
+          <w:tcPr>
+            <w:tcW w:type="dxa" w:w="7326"/>
+            <w:tcBorders>
+              <w:top w:val="single" w:color="A6A6A6" w:sz="4"/>
+              <w:left w:val="single" w:color="A6A6A6" w:sz="4"/>
+              <w:bottom w:val="single" w:color="A6A6A6" w:sz="4"/>
+              <w:right w:val="single" w:color="A6A6A6" w:sz="4"/>
+            </w:tcBorders>
+            <w:shd w:fill="DCE9F5" w:color="auto" w:val="clear"/>
+            <w:tcMar>
+              <w:top w:type="dxa" w:w="60"/>
+              <w:left w:type="dxa" w:w="100"/>
+              <w:bottom w:type="dxa" w:w="60"/>
+              <w:right w:type="dxa" w:w="100"/>
+            </w:tcMar>
+          </w:tcPr>
+          <w:p>
+            <w:r>
+              <w:rPr>
+                <w:b w:val="false"/>
+                <w:bCs w:val="false"/>
+                <w:sz w:val="20"/>
+                <w:szCs w:val="20"/>
+              </w:rPr>
+              <w:t>B9 aprobado: zonas del empleado y del administrador en tres PR (feature/web-empleado, feature/web-admin-reservas y feature/web-admin-gestion). El admin reserva por un cliente desde los horarios libres; el historial de cambios mostrará quién hizo cada cambio con un campo realizadoPorNombre nuevo en el backend (B9b); agenda por semanas; Completada y No presentado solo desde la hora de inicio; duración del servicio elegida de una lista de múltiplos del intervalo.</w:t>
             </w:r>
           </w:p>
         </w:tc>

</xml_diff>

<commit_message>
docs: guía de las reservas del admin y B9a fusionado (PR #12)
Co-Authored-By: Claude Opus 5.5 <noreply@anthropic.com>
Claude-Session: https://claude.ai/code/session_0172dfujCw3mMf6MY86dn9Fv
</commit_message>
<xml_diff>
--- a/docs/Doc.docx
+++ b/docs/Doc.docx
@@ -29192,7 +29192,7 @@
                 <w:sz w:val="20"/>
                 <w:szCs w:val="20"/>
               </w:rPr>
-              <w:t>En tres PR. B9a (feature/web-empleado): agenda semanal del empleado con su horario, días de cierre y citas; citas asignadas con filtros; detalle con el teléfono del cliente y cambio de estado (Completada y No presentado desde la hora de inicio, Cancelar con motivo obligatorio); mis servicios. Hecho. B9b (feature/web-admin-reservas): reservas con filtros, detalle con historial y reservar por un cliente desde los horarios libres. B9c (feature/web-admin-gestion): servicios, empleados, horarios, días de cierre y configuración del negocio (detalle en propuestas/4.9-B9-web-empleado-admin.md).</w:t>
+              <w:t>En tres PR. B9a (feature/web-empleado): agenda semanal del empleado con su horario, días de cierre y citas; citas asignadas con filtros; detalle con el teléfono del cliente y cambio de estado (Completada y No presentado desde la hora de inicio, Cancelar con motivo obligatorio); mis servicios. Hecho. B9b (feature/web-admin-reservas): reservas con filtros de estado, fechas, profesional y cliente; detalle con el correo del cliente y el historial con quién hizo cada cambio (nuevo campo realizadoPorNombre en el backend); reservar por un cliente registrado eligiendo la hora en los horarios libres. Hecho. B9c (feature/web-admin-gestion): servicios, empleados, horarios, días de cierre y configuración del negocio (detalle en propuestas/4.9-B9-web-empleado-admin.md).</w:t>
             </w:r>
           </w:p>
         </w:tc>
@@ -32142,6 +32142,66 @@
                 <w:szCs w:val="20"/>
               </w:rPr>
               <w:t>B9 aprobado: zonas del empleado y del administrador en tres PR (feature/web-empleado, feature/web-admin-reservas y feature/web-admin-gestion). El admin reserva por un cliente desde los horarios libres; el historial de cambios mostrará quién hizo cada cambio con un campo realizadoPorNombre nuevo en el backend (B9b); agenda por semanas; Completada y No presentado solo desde la hora de inicio; duración del servicio elegida de una lista de múltiplos del intervalo.</w:t>
+            </w:r>
+          </w:p>
+        </w:tc>
+      </w:tr>
+      <w:tr>
+        <w:tc>
+          <w:tcPr>
+            <w:tcW w:type="dxa" w:w="1700"/>
+            <w:tcBorders>
+              <w:top w:val="single" w:color="A6A6A6" w:sz="4"/>
+              <w:left w:val="single" w:color="A6A6A6" w:sz="4"/>
+              <w:bottom w:val="single" w:color="A6A6A6" w:sz="4"/>
+              <w:right w:val="single" w:color="A6A6A6" w:sz="4"/>
+            </w:tcBorders>
+            <w:shd w:fill="DCE9F5" w:color="auto" w:val="clear"/>
+            <w:tcMar>
+              <w:top w:type="dxa" w:w="60"/>
+              <w:left w:type="dxa" w:w="100"/>
+              <w:bottom w:type="dxa" w:w="60"/>
+              <w:right w:type="dxa" w:w="100"/>
+            </w:tcMar>
+          </w:tcPr>
+          <w:p>
+            <w:r>
+              <w:rPr>
+                <w:b w:val="false"/>
+                <w:bCs w:val="false"/>
+                <w:sz w:val="20"/>
+                <w:szCs w:val="20"/>
+              </w:rPr>
+              <w:t>31/10/2026</w:t>
+            </w:r>
+          </w:p>
+        </w:tc>
+        <w:tc>
+          <w:tcPr>
+            <w:tcW w:type="dxa" w:w="7326"/>
+            <w:tcBorders>
+              <w:top w:val="single" w:color="A6A6A6" w:sz="4"/>
+              <w:left w:val="single" w:color="A6A6A6" w:sz="4"/>
+              <w:bottom w:val="single" w:color="A6A6A6" w:sz="4"/>
+              <w:right w:val="single" w:color="A6A6A6" w:sz="4"/>
+            </w:tcBorders>
+            <w:shd w:fill="DCE9F5" w:color="auto" w:val="clear"/>
+            <w:tcMar>
+              <w:top w:type="dxa" w:w="60"/>
+              <w:left w:type="dxa" w:w="100"/>
+              <w:bottom w:type="dxa" w:w="60"/>
+              <w:right w:type="dxa" w:w="100"/>
+            </w:tcMar>
+          </w:tcPr>
+          <w:p>
+            <w:r>
+              <w:rPr>
+                <w:b w:val="false"/>
+                <w:bCs w:val="false"/>
+                <w:sz w:val="20"/>
+                <w:szCs w:val="20"/>
+              </w:rPr>
+              <w:t>B9a fusionado (PR #12).</w:t>
             </w:r>
           </w:p>
         </w:tc>

</xml_diff>

<commit_message>
docs: guía del panel del admin, B9b fusionado (PR #13) y fase 4 cerrada
Co-Authored-By: Claude Opus 5.5 <noreply@anthropic.com>
Claude-Session: https://claude.ai/code/session_0172dfujCw3mMf6MY86dn9Fv
</commit_message>
<xml_diff>
--- a/docs/Doc.docx
+++ b/docs/Doc.docx
@@ -535,7 +535,7 @@
                 <w:sz w:val="20"/>
                 <w:szCs w:val="20"/>
               </w:rPr>
-              <w:t xml:space="preserve">En curso</w:t>
+              <w:t xml:space="preserve">Completada (B1 a B9)</w:t>
             </w:r>
           </w:p>
         </w:tc>
@@ -29192,7 +29192,7 @@
                 <w:sz w:val="20"/>
                 <w:szCs w:val="20"/>
               </w:rPr>
-              <w:t>En tres PR. B9a (feature/web-empleado): agenda semanal del empleado con su horario, días de cierre y citas; citas asignadas con filtros; detalle con el teléfono del cliente y cambio de estado (Completada y No presentado desde la hora de inicio, Cancelar con motivo obligatorio); mis servicios. Hecho. B9b (feature/web-admin-reservas): reservas con filtros de estado, fechas, profesional y cliente; detalle con el correo del cliente y el historial con quién hizo cada cambio (nuevo campo realizadoPorNombre en el backend); reservar por un cliente registrado eligiendo la hora en los horarios libres. Hecho. B9c (feature/web-admin-gestion): servicios, empleados, horarios, días de cierre y configuración del negocio (detalle en propuestas/4.9-B9-web-empleado-admin.md).</w:t>
+              <w:t>En tres PR. B9a (feature/web-empleado): agenda semanal del empleado con su horario, días de cierre y citas; citas asignadas con filtros; detalle con el teléfono del cliente y cambio de estado (Completada y No presentado desde la hora de inicio, Cancelar con motivo obligatorio); mis servicios. B9b (feature/web-admin-reservas): reservas con filtros de estado, fechas, profesional y cliente; detalle con el correo del cliente y el historial con quién hizo cada cambio (nuevo campo realizadoPorNombre en el backend); reservar por un cliente registrado eligiendo la hora en los horarios libres. B9c (feature/web-admin-gestion): servicios (duración elegida entre los múltiplos del intervalo, activar y desactivar), empleados (alta con la contraseña temporal mostrada una sola vez, datos, servicios, otra contraseña temporal, activar y desactivar), horario general y horario propio de cada empleado con un editor semanal, días de cierre y configuración del negocio; las citas que quedan fuera de un horario o cierre se listan, nunca se cancelan. Hecho (detalle en propuestas/4.9-B9-web-empleado-admin.md).</w:t>
             </w:r>
           </w:p>
         </w:tc>
@@ -32202,6 +32202,126 @@
                 <w:szCs w:val="20"/>
               </w:rPr>
               <w:t>B9a fusionado (PR #12).</w:t>
+            </w:r>
+          </w:p>
+        </w:tc>
+      </w:tr>
+      <w:tr>
+        <w:tc>
+          <w:tcPr>
+            <w:tcW w:type="dxa" w:w="1700"/>
+            <w:tcBorders>
+              <w:top w:val="single" w:color="A6A6A6" w:sz="4"/>
+              <w:left w:val="single" w:color="A6A6A6" w:sz="4"/>
+              <w:bottom w:val="single" w:color="A6A6A6" w:sz="4"/>
+              <w:right w:val="single" w:color="A6A6A6" w:sz="4"/>
+            </w:tcBorders>
+            <w:shd w:fill="DCE9F5" w:color="auto" w:val="clear"/>
+            <w:tcMar>
+              <w:top w:type="dxa" w:w="60"/>
+              <w:left w:type="dxa" w:w="100"/>
+              <w:bottom w:type="dxa" w:w="60"/>
+              <w:right w:type="dxa" w:w="100"/>
+            </w:tcMar>
+          </w:tcPr>
+          <w:p>
+            <w:r>
+              <w:rPr>
+                <w:b w:val="false"/>
+                <w:bCs w:val="false"/>
+                <w:sz w:val="20"/>
+                <w:szCs w:val="20"/>
+              </w:rPr>
+              <w:t>31/10/2026</w:t>
+            </w:r>
+          </w:p>
+        </w:tc>
+        <w:tc>
+          <w:tcPr>
+            <w:tcW w:type="dxa" w:w="7326"/>
+            <w:tcBorders>
+              <w:top w:val="single" w:color="A6A6A6" w:sz="4"/>
+              <w:left w:val="single" w:color="A6A6A6" w:sz="4"/>
+              <w:bottom w:val="single" w:color="A6A6A6" w:sz="4"/>
+              <w:right w:val="single" w:color="A6A6A6" w:sz="4"/>
+            </w:tcBorders>
+            <w:shd w:fill="DCE9F5" w:color="auto" w:val="clear"/>
+            <w:tcMar>
+              <w:top w:type="dxa" w:w="60"/>
+              <w:left w:type="dxa" w:w="100"/>
+              <w:bottom w:type="dxa" w:w="60"/>
+              <w:right w:type="dxa" w:w="100"/>
+            </w:tcMar>
+          </w:tcPr>
+          <w:p>
+            <w:r>
+              <w:rPr>
+                <w:b w:val="false"/>
+                <w:bCs w:val="false"/>
+                <w:sz w:val="20"/>
+                <w:szCs w:val="20"/>
+              </w:rPr>
+              <w:t>B9b fusionado (PR #13).</w:t>
+            </w:r>
+          </w:p>
+        </w:tc>
+      </w:tr>
+      <w:tr>
+        <w:tc>
+          <w:tcPr>
+            <w:tcW w:type="dxa" w:w="1700"/>
+            <w:tcBorders>
+              <w:top w:val="single" w:color="A6A6A6" w:sz="4"/>
+              <w:left w:val="single" w:color="A6A6A6" w:sz="4"/>
+              <w:bottom w:val="single" w:color="A6A6A6" w:sz="4"/>
+              <w:right w:val="single" w:color="A6A6A6" w:sz="4"/>
+            </w:tcBorders>
+            <w:shd w:fill="DCE9F5" w:color="auto" w:val="clear"/>
+            <w:tcMar>
+              <w:top w:type="dxa" w:w="60"/>
+              <w:left w:type="dxa" w:w="100"/>
+              <w:bottom w:type="dxa" w:w="60"/>
+              <w:right w:type="dxa" w:w="100"/>
+            </w:tcMar>
+          </w:tcPr>
+          <w:p>
+            <w:r>
+              <w:rPr>
+                <w:b w:val="false"/>
+                <w:bCs w:val="false"/>
+                <w:sz w:val="20"/>
+                <w:szCs w:val="20"/>
+              </w:rPr>
+              <w:t>31/10/2026</w:t>
+            </w:r>
+          </w:p>
+        </w:tc>
+        <w:tc>
+          <w:tcPr>
+            <w:tcW w:type="dxa" w:w="7326"/>
+            <w:tcBorders>
+              <w:top w:val="single" w:color="A6A6A6" w:sz="4"/>
+              <w:left w:val="single" w:color="A6A6A6" w:sz="4"/>
+              <w:bottom w:val="single" w:color="A6A6A6" w:sz="4"/>
+              <w:right w:val="single" w:color="A6A6A6" w:sz="4"/>
+            </w:tcBorders>
+            <w:shd w:fill="DCE9F5" w:color="auto" w:val="clear"/>
+            <w:tcMar>
+              <w:top w:type="dxa" w:w="60"/>
+              <w:left w:type="dxa" w:w="100"/>
+              <w:bottom w:type="dxa" w:w="60"/>
+              <w:right w:type="dxa" w:w="100"/>
+            </w:tcMar>
+          </w:tcPr>
+          <w:p>
+            <w:r>
+              <w:rPr>
+                <w:b w:val="false"/>
+                <w:bCs w:val="false"/>
+                <w:sz w:val="20"/>
+                <w:szCs w:val="20"/>
+              </w:rPr>
+              <w:t>B9c terminado: panel del administrador (servicios, empleados, horarios, días de cierre y negocio). Con él termina el B9 y se cierra la fase 4 (Desarrollo); la siguiente es la fase 5 (Pruebas).</w:t>
             </w:r>
           </w:p>
         </w:tc>

</xml_diff>

<commit_message>
docs: plan de pruebas, matriz de trazabilidad y plan de la fase 5 (5a)
Incluye la nota "B9c fusionado (PR #14)" en el registro de decisiones.

Co-Authored-By: Claude Opus 5.5 <noreply@anthropic.com>
Claude-Session: https://claude.ai/code/session_0172dfum7zSk4ESv4kuduVrN
</commit_message>
<xml_diff>
--- a/docs/Doc.docx
+++ b/docs/Doc.docx
@@ -29208,6 +29208,457 @@
         </w:numPr>
       </w:pPr>
       <w:r>
+        <w:t>Pruebas (fase 5)</w:t>
+      </w:r>
+    </w:p>
+    <w:p>
+      <w:pPr>
+        <w:spacing w:after="120"/>
+      </w:pPr>
+      <w:r>
+        <w:t>Plan aprobado en el paso 5.0 (detalle en propuestas/5.0-plan-de-pruebas.md). La fase no empieza de cero: cada bloque de la fase 4 trajo sus pruebas (226 en el backend y 122 en la web). Consiste en medir la cobertura, cubrir los huecos, probar la aplicación de punta a punta y documentarlo. El plan de pruebas y la matriz de trazabilidad están en docs/pruebas/.</w:t>
+      </w:r>
+    </w:p>
+    <w:tbl>
+      <w:tblPr>
+        <w:tblW w:type="dxa" w:w="9026"/>
+        <w:tblBorders>
+          <w:top w:val="single" w:color="auto" w:sz="4"/>
+          <w:left w:val="single" w:color="auto" w:sz="4"/>
+          <w:bottom w:val="single" w:color="auto" w:sz="4"/>
+          <w:right w:val="single" w:color="auto" w:sz="4"/>
+          <w:insideH w:val="single" w:color="auto" w:sz="4"/>
+          <w:insideV w:val="single" w:color="auto" w:sz="4"/>
+        </w:tblBorders>
+      </w:tblPr>
+      <w:tblGrid>
+        <w:gridCol w:w="2600"/>
+        <w:gridCol w:w="6426"/>
+      </w:tblGrid>
+      <w:tr>
+        <w:trPr>
+          <w:tblHeader/>
+        </w:trPr>
+        <w:tc>
+          <w:tcPr>
+            <w:tcW w:type="dxa" w:w="2600"/>
+            <w:tcBorders>
+              <w:top w:val="single" w:color="A6A6A6" w:sz="4"/>
+              <w:left w:val="single" w:color="A6A6A6" w:sz="4"/>
+              <w:bottom w:val="single" w:color="A6A6A6" w:sz="4"/>
+              <w:right w:val="single" w:color="A6A6A6" w:sz="4"/>
+            </w:tcBorders>
+            <w:shd w:fill="1F4E79" w:color="auto" w:val="clear"/>
+            <w:tcMar>
+              <w:top w:type="dxa" w:w="60"/>
+              <w:left w:type="dxa" w:w="100"/>
+              <w:bottom w:type="dxa" w:w="60"/>
+              <w:right w:type="dxa" w:w="100"/>
+            </w:tcMar>
+          </w:tcPr>
+          <w:p>
+            <w:r>
+              <w:rPr>
+                <w:b/>
+                <w:bCs/>
+                <w:color w:val="FFFFFF"/>
+                <w:sz w:val="20"/>
+                <w:szCs w:val="20"/>
+              </w:rPr>
+              <w:t>Paso</w:t>
+            </w:r>
+          </w:p>
+        </w:tc>
+        <w:tc>
+          <w:tcPr>
+            <w:tcW w:type="dxa" w:w="6426"/>
+            <w:tcBorders>
+              <w:top w:val="single" w:color="A6A6A6" w:sz="4"/>
+              <w:left w:val="single" w:color="A6A6A6" w:sz="4"/>
+              <w:bottom w:val="single" w:color="A6A6A6" w:sz="4"/>
+              <w:right w:val="single" w:color="A6A6A6" w:sz="4"/>
+            </w:tcBorders>
+            <w:shd w:fill="1F4E79" w:color="auto" w:val="clear"/>
+            <w:tcMar>
+              <w:top w:type="dxa" w:w="60"/>
+              <w:left w:type="dxa" w:w="100"/>
+              <w:bottom w:type="dxa" w:w="60"/>
+              <w:right w:type="dxa" w:w="100"/>
+            </w:tcMar>
+          </w:tcPr>
+          <w:p>
+            <w:r>
+              <w:rPr>
+                <w:b/>
+                <w:bCs/>
+                <w:color w:val="FFFFFF"/>
+                <w:sz w:val="20"/>
+                <w:szCs w:val="20"/>
+              </w:rPr>
+              <w:t>Contenido</w:t>
+            </w:r>
+          </w:p>
+        </w:tc>
+      </w:tr>
+      <w:tr>
+        <w:tc>
+          <w:tcPr>
+            <w:tcW w:type="dxa" w:w="2600"/>
+            <w:tcBorders>
+              <w:top w:val="single" w:color="A6A6A6" w:sz="4"/>
+              <w:left w:val="single" w:color="A6A6A6" w:sz="4"/>
+              <w:bottom w:val="single" w:color="A6A6A6" w:sz="4"/>
+              <w:right w:val="single" w:color="A6A6A6" w:sz="4"/>
+            </w:tcBorders>
+            <w:tcMar>
+              <w:top w:type="dxa" w:w="60"/>
+              <w:left w:type="dxa" w:w="100"/>
+              <w:bottom w:type="dxa" w:w="60"/>
+              <w:right w:type="dxa" w:w="100"/>
+            </w:tcMar>
+          </w:tcPr>
+          <w:p>
+            <w:r>
+              <w:rPr>
+                <w:b w:val="false"/>
+                <w:bCs w:val="false"/>
+                <w:sz w:val="20"/>
+                <w:szCs w:val="20"/>
+              </w:rPr>
+              <w:t>5a · Plan, trazabilidad y cobertura</w:t>
+            </w:r>
+          </w:p>
+        </w:tc>
+        <w:tc>
+          <w:tcPr>
+            <w:tcW w:type="dxa" w:w="6426"/>
+            <w:tcBorders>
+              <w:top w:val="single" w:color="A6A6A6" w:sz="4"/>
+              <w:left w:val="single" w:color="A6A6A6" w:sz="4"/>
+              <w:bottom w:val="single" w:color="A6A6A6" w:sz="4"/>
+              <w:right w:val="single" w:color="A6A6A6" w:sz="4"/>
+            </w:tcBorders>
+            <w:tcMar>
+              <w:top w:type="dxa" w:w="60"/>
+              <w:left w:type="dxa" w:w="100"/>
+              <w:bottom w:type="dxa" w:w="60"/>
+              <w:right w:type="dxa" w:w="100"/>
+            </w:tcMar>
+          </w:tcPr>
+          <w:p>
+            <w:r>
+              <w:rPr>
+                <w:b w:val="false"/>
+                <w:bCs w:val="false"/>
+                <w:sz w:val="20"/>
+                <w:szCs w:val="20"/>
+              </w:rPr>
+              <w:t>Plan de pruebas y matriz de trazabilidad (docs/pruebas/). JaCoCo en el backend y @vitest/coverage-v8 en la web: la CI muestra el resumen de la cobertura y guarda los informes como artefactos. Arreglada una prueba de la web que fallaba de forma intermitente (el servidor simulado no recordaba la desactivación del servicio).</w:t>
+            </w:r>
+          </w:p>
+        </w:tc>
+      </w:tr>
+      <w:tr>
+        <w:tc>
+          <w:tcPr>
+            <w:tcW w:type="dxa" w:w="2600"/>
+            <w:tcBorders>
+              <w:top w:val="single" w:color="A6A6A6" w:sz="4"/>
+              <w:left w:val="single" w:color="A6A6A6" w:sz="4"/>
+              <w:bottom w:val="single" w:color="A6A6A6" w:sz="4"/>
+              <w:right w:val="single" w:color="A6A6A6" w:sz="4"/>
+            </w:tcBorders>
+            <w:tcMar>
+              <w:top w:type="dxa" w:w="60"/>
+              <w:left w:type="dxa" w:w="100"/>
+              <w:bottom w:type="dxa" w:w="60"/>
+              <w:right w:type="dxa" w:w="100"/>
+            </w:tcMar>
+          </w:tcPr>
+          <w:p>
+            <w:r>
+              <w:rPr>
+                <w:b w:val="false"/>
+                <w:bCs w:val="false"/>
+                <w:sz w:val="20"/>
+                <w:szCs w:val="20"/>
+              </w:rPr>
+              <w:t>5b · Huecos y permisos</w:t>
+            </w:r>
+          </w:p>
+        </w:tc>
+        <w:tc>
+          <w:tcPr>
+            <w:tcW w:type="dxa" w:w="6426"/>
+            <w:tcBorders>
+              <w:top w:val="single" w:color="A6A6A6" w:sz="4"/>
+              <w:left w:val="single" w:color="A6A6A6" w:sz="4"/>
+              <w:bottom w:val="single" w:color="A6A6A6" w:sz="4"/>
+              <w:right w:val="single" w:color="A6A6A6" w:sz="4"/>
+            </w:tcBorders>
+            <w:tcMar>
+              <w:top w:type="dxa" w:w="60"/>
+              <w:left w:type="dxa" w:w="100"/>
+              <w:bottom w:type="dxa" w:w="60"/>
+              <w:right w:type="dxa" w:w="100"/>
+            </w:tcMar>
+          </w:tcPr>
+          <w:p>
+            <w:r>
+              <w:rPr>
+                <w:b w:val="false"/>
+                <w:bCs w:val="false"/>
+                <w:sz w:val="20"/>
+                <w:szCs w:val="20"/>
+              </w:rPr>
+              <w:t>Pruebas de los huecos de la matriz, matriz de permisos que recorre todos los endpoints con los cuatro perfiles (RNF-002) y umbral mínimo de cobertura en la CI (80 % backend, 85 % web).</w:t>
+            </w:r>
+          </w:p>
+        </w:tc>
+      </w:tr>
+      <w:tr>
+        <w:tc>
+          <w:tcPr>
+            <w:tcW w:type="dxa" w:w="2600"/>
+            <w:tcBorders>
+              <w:top w:val="single" w:color="A6A6A6" w:sz="4"/>
+              <w:left w:val="single" w:color="A6A6A6" w:sz="4"/>
+              <w:bottom w:val="single" w:color="A6A6A6" w:sz="4"/>
+              <w:right w:val="single" w:color="A6A6A6" w:sz="4"/>
+            </w:tcBorders>
+            <w:tcMar>
+              <w:top w:type="dxa" w:w="60"/>
+              <w:left w:type="dxa" w:w="100"/>
+              <w:bottom w:type="dxa" w:w="60"/>
+              <w:right w:type="dxa" w:w="100"/>
+            </w:tcMar>
+          </w:tcPr>
+          <w:p>
+            <w:r>
+              <w:rPr>
+                <w:b w:val="false"/>
+                <w:bCs w:val="false"/>
+                <w:sz w:val="20"/>
+                <w:szCs w:val="20"/>
+              </w:rPr>
+              <w:t>5c · De punta a punta</w:t>
+            </w:r>
+          </w:p>
+        </w:tc>
+        <w:tc>
+          <w:tcPr>
+            <w:tcW w:type="dxa" w:w="6426"/>
+            <w:tcBorders>
+              <w:top w:val="single" w:color="A6A6A6" w:sz="4"/>
+              <w:left w:val="single" w:color="A6A6A6" w:sz="4"/>
+              <w:bottom w:val="single" w:color="A6A6A6" w:sz="4"/>
+              <w:right w:val="single" w:color="A6A6A6" w:sz="4"/>
+            </w:tcBorders>
+            <w:tcMar>
+              <w:top w:type="dxa" w:w="60"/>
+              <w:left w:type="dxa" w:w="100"/>
+              <w:bottom w:type="dxa" w:w="60"/>
+              <w:right w:type="dxa" w:w="100"/>
+            </w:tcMar>
+          </w:tcPr>
+          <w:p>
+            <w:r>
+              <w:rPr>
+                <w:b w:val="false"/>
+                <w:bCs w:val="false"/>
+                <w:sz w:val="20"/>
+                <w:szCs w:val="20"/>
+              </w:rPr>
+              <w:t>Playwright en e2e/ con la web, el backend y PostgreSQL reales; un flujo principal por perfil.</w:t>
+            </w:r>
+          </w:p>
+        </w:tc>
+      </w:tr>
+      <w:tr>
+        <w:tc>
+          <w:tcPr>
+            <w:tcW w:type="dxa" w:w="2600"/>
+            <w:tcBorders>
+              <w:top w:val="single" w:color="A6A6A6" w:sz="4"/>
+              <w:left w:val="single" w:color="A6A6A6" w:sz="4"/>
+              <w:bottom w:val="single" w:color="A6A6A6" w:sz="4"/>
+              <w:right w:val="single" w:color="A6A6A6" w:sz="4"/>
+            </w:tcBorders>
+            <w:tcMar>
+              <w:top w:type="dxa" w:w="60"/>
+              <w:left w:type="dxa" w:w="100"/>
+              <w:bottom w:type="dxa" w:w="60"/>
+              <w:right w:type="dxa" w:w="100"/>
+            </w:tcMar>
+          </w:tcPr>
+          <w:p>
+            <w:r>
+              <w:rPr>
+                <w:b w:val="false"/>
+                <w:bCs w:val="false"/>
+                <w:sz w:val="20"/>
+                <w:szCs w:val="20"/>
+              </w:rPr>
+              <w:t>5d · No funcionales</w:t>
+            </w:r>
+          </w:p>
+        </w:tc>
+        <w:tc>
+          <w:tcPr>
+            <w:tcW w:type="dxa" w:w="6426"/>
+            <w:tcBorders>
+              <w:top w:val="single" w:color="A6A6A6" w:sz="4"/>
+              <w:left w:val="single" w:color="A6A6A6" w:sz="4"/>
+              <w:bottom w:val="single" w:color="A6A6A6" w:sz="4"/>
+              <w:right w:val="single" w:color="A6A6A6" w:sz="4"/>
+            </w:tcBorders>
+            <w:tcMar>
+              <w:top w:type="dxa" w:w="60"/>
+              <w:left w:type="dxa" w:w="100"/>
+              <w:bottom w:type="dxa" w:w="60"/>
+              <w:right w:type="dxa" w:w="100"/>
+            </w:tcMar>
+          </w:tcPr>
+          <w:p>
+            <w:r>
+              <w:rPr>
+                <w:b w:val="false"/>
+                <w:bCs w:val="false"/>
+                <w:sz w:val="20"/>
+                <w:szCs w:val="20"/>
+              </w:rPr>
+              <w:t>Móvil (RNF-008), accesibilidad con axe, reserva simultánea desde dos navegadores (RNF-003) y comprobaciones de seguridad básicas.</w:t>
+            </w:r>
+          </w:p>
+        </w:tc>
+      </w:tr>
+      <w:tr>
+        <w:tc>
+          <w:tcPr>
+            <w:tcW w:type="dxa" w:w="2600"/>
+            <w:tcBorders>
+              <w:top w:val="single" w:color="A6A6A6" w:sz="4"/>
+              <w:left w:val="single" w:color="A6A6A6" w:sz="4"/>
+              <w:bottom w:val="single" w:color="A6A6A6" w:sz="4"/>
+              <w:right w:val="single" w:color="A6A6A6" w:sz="4"/>
+            </w:tcBorders>
+            <w:tcMar>
+              <w:top w:type="dxa" w:w="60"/>
+              <w:left w:type="dxa" w:w="100"/>
+              <w:bottom w:type="dxa" w:w="60"/>
+              <w:right w:type="dxa" w:w="100"/>
+            </w:tcMar>
+          </w:tcPr>
+          <w:p>
+            <w:r>
+              <w:rPr>
+                <w:b w:val="false"/>
+                <w:bCs w:val="false"/>
+                <w:sz w:val="20"/>
+                <w:szCs w:val="20"/>
+              </w:rPr>
+              <w:t>5e · Manuales y defectos</w:t>
+            </w:r>
+          </w:p>
+        </w:tc>
+        <w:tc>
+          <w:tcPr>
+            <w:tcW w:type="dxa" w:w="6426"/>
+            <w:tcBorders>
+              <w:top w:val="single" w:color="A6A6A6" w:sz="4"/>
+              <w:left w:val="single" w:color="A6A6A6" w:sz="4"/>
+              <w:bottom w:val="single" w:color="A6A6A6" w:sz="4"/>
+              <w:right w:val="single" w:color="A6A6A6" w:sz="4"/>
+            </w:tcBorders>
+            <w:tcMar>
+              <w:top w:type="dxa" w:w="60"/>
+              <w:left w:type="dxa" w:w="100"/>
+              <w:bottom w:type="dxa" w:w="60"/>
+              <w:right w:type="dxa" w:w="100"/>
+            </w:tcMar>
+          </w:tcPr>
+          <w:p>
+            <w:r>
+              <w:rPr>
+                <w:b w:val="false"/>
+                <w:bCs w:val="false"/>
+                <w:sz w:val="20"/>
+                <w:szCs w:val="20"/>
+              </w:rPr>
+              <w:t>Lista de comprobación para el perfil demo; cada defecto se arregla en una rama fix/... con una prueba que lo reproduce.</w:t>
+            </w:r>
+          </w:p>
+        </w:tc>
+      </w:tr>
+      <w:tr>
+        <w:tc>
+          <w:tcPr>
+            <w:tcW w:type="dxa" w:w="2600"/>
+            <w:tcBorders>
+              <w:top w:val="single" w:color="A6A6A6" w:sz="4"/>
+              <w:left w:val="single" w:color="A6A6A6" w:sz="4"/>
+              <w:bottom w:val="single" w:color="A6A6A6" w:sz="4"/>
+              <w:right w:val="single" w:color="A6A6A6" w:sz="4"/>
+            </w:tcBorders>
+            <w:tcMar>
+              <w:top w:type="dxa" w:w="60"/>
+              <w:left w:type="dxa" w:w="100"/>
+              <w:bottom w:type="dxa" w:w="60"/>
+              <w:right w:type="dxa" w:w="100"/>
+            </w:tcMar>
+          </w:tcPr>
+          <w:p>
+            <w:r>
+              <w:rPr>
+                <w:b w:val="false"/>
+                <w:bCs w:val="false"/>
+                <w:sz w:val="20"/>
+                <w:szCs w:val="20"/>
+              </w:rPr>
+              <w:t>5f · Informe</w:t>
+            </w:r>
+          </w:p>
+        </w:tc>
+        <w:tc>
+          <w:tcPr>
+            <w:tcW w:type="dxa" w:w="6426"/>
+            <w:tcBorders>
+              <w:top w:val="single" w:color="A6A6A6" w:sz="4"/>
+              <w:left w:val="single" w:color="A6A6A6" w:sz="4"/>
+              <w:bottom w:val="single" w:color="A6A6A6" w:sz="4"/>
+              <w:right w:val="single" w:color="A6A6A6" w:sz="4"/>
+            </w:tcBorders>
+            <w:tcMar>
+              <w:top w:type="dxa" w:w="60"/>
+              <w:left w:type="dxa" w:w="100"/>
+              <w:bottom w:type="dxa" w:w="60"/>
+              <w:right w:type="dxa" w:w="100"/>
+            </w:tcMar>
+          </w:tcPr>
+          <w:p>
+            <w:r>
+              <w:rPr>
+                <w:b w:val="false"/>
+                <w:bCs w:val="false"/>
+                <w:sz w:val="20"/>
+                <w:szCs w:val="20"/>
+              </w:rPr>
+              <w:t>Informe de pruebas y cierre de la fase.</w:t>
+            </w:r>
+          </w:p>
+        </w:tc>
+      </w:tr>
+    </w:tbl>
+    <w:p/>
+    <w:p>
+      <w:pPr>
+        <w:pStyle w:val="Heading1"/>
+        <w:numPr>
+          <w:ilvl w:val="0"/>
+          <w:numId w:val="2"/>
+        </w:numPr>
+      </w:pPr>
+      <w:r>
         <w:t xml:space="preserve">Registro de decisiones</w:t>
       </w:r>
     </w:p>
@@ -32322,6 +32773,126 @@
                 <w:szCs w:val="20"/>
               </w:rPr>
               <w:t>B9c terminado: panel del administrador (servicios, empleados, horarios, días de cierre y negocio). Con él termina el B9 y se cierra la fase 4 (Desarrollo); la siguiente es la fase 5 (Pruebas).</w:t>
+            </w:r>
+          </w:p>
+        </w:tc>
+      </w:tr>
+      <w:tr>
+        <w:tc>
+          <w:tcPr>
+            <w:tcW w:type="dxa" w:w="1700"/>
+            <w:tcBorders>
+              <w:top w:val="single" w:color="A6A6A6" w:sz="4"/>
+              <w:left w:val="single" w:color="A6A6A6" w:sz="4"/>
+              <w:bottom w:val="single" w:color="A6A6A6" w:sz="4"/>
+              <w:right w:val="single" w:color="A6A6A6" w:sz="4"/>
+            </w:tcBorders>
+            <w:shd w:fill="DCE9F5" w:color="auto" w:val="clear"/>
+            <w:tcMar>
+              <w:top w:type="dxa" w:w="60"/>
+              <w:left w:type="dxa" w:w="100"/>
+              <w:bottom w:type="dxa" w:w="60"/>
+              <w:right w:type="dxa" w:w="100"/>
+            </w:tcMar>
+          </w:tcPr>
+          <w:p>
+            <w:r>
+              <w:rPr>
+                <w:b w:val="false"/>
+                <w:bCs w:val="false"/>
+                <w:sz w:val="20"/>
+                <w:szCs w:val="20"/>
+              </w:rPr>
+              <w:t>31/10/2026</w:t>
+            </w:r>
+          </w:p>
+        </w:tc>
+        <w:tc>
+          <w:tcPr>
+            <w:tcW w:type="dxa" w:w="7326"/>
+            <w:tcBorders>
+              <w:top w:val="single" w:color="A6A6A6" w:sz="4"/>
+              <w:left w:val="single" w:color="A6A6A6" w:sz="4"/>
+              <w:bottom w:val="single" w:color="A6A6A6" w:sz="4"/>
+              <w:right w:val="single" w:color="A6A6A6" w:sz="4"/>
+            </w:tcBorders>
+            <w:shd w:fill="DCE9F5" w:color="auto" w:val="clear"/>
+            <w:tcMar>
+              <w:top w:type="dxa" w:w="60"/>
+              <w:left w:type="dxa" w:w="100"/>
+              <w:bottom w:type="dxa" w:w="60"/>
+              <w:right w:type="dxa" w:w="100"/>
+            </w:tcMar>
+          </w:tcPr>
+          <w:p>
+            <w:r>
+              <w:rPr>
+                <w:b w:val="false"/>
+                <w:bCs w:val="false"/>
+                <w:sz w:val="20"/>
+                <w:szCs w:val="20"/>
+              </w:rPr>
+              <w:t>B9c fusionado (PR #14).</w:t>
+            </w:r>
+          </w:p>
+        </w:tc>
+      </w:tr>
+      <w:tr>
+        <w:tc>
+          <w:tcPr>
+            <w:tcW w:type="dxa" w:w="1700"/>
+            <w:tcBorders>
+              <w:top w:val="single" w:color="A6A6A6" w:sz="4"/>
+              <w:left w:val="single" w:color="A6A6A6" w:sz="4"/>
+              <w:bottom w:val="single" w:color="A6A6A6" w:sz="4"/>
+              <w:right w:val="single" w:color="A6A6A6" w:sz="4"/>
+            </w:tcBorders>
+            <w:shd w:fill="DCE9F5" w:color="auto" w:val="clear"/>
+            <w:tcMar>
+              <w:top w:type="dxa" w:w="60"/>
+              <w:left w:type="dxa" w:w="100"/>
+              <w:bottom w:type="dxa" w:w="60"/>
+              <w:right w:type="dxa" w:w="100"/>
+            </w:tcMar>
+          </w:tcPr>
+          <w:p>
+            <w:r>
+              <w:rPr>
+                <w:b w:val="false"/>
+                <w:bCs w:val="false"/>
+                <w:sz w:val="20"/>
+                <w:szCs w:val="20"/>
+              </w:rPr>
+              <w:t>31/10/2026</w:t>
+            </w:r>
+          </w:p>
+        </w:tc>
+        <w:tc>
+          <w:tcPr>
+            <w:tcW w:type="dxa" w:w="7326"/>
+            <w:tcBorders>
+              <w:top w:val="single" w:color="A6A6A6" w:sz="4"/>
+              <w:left w:val="single" w:color="A6A6A6" w:sz="4"/>
+              <w:bottom w:val="single" w:color="A6A6A6" w:sz="4"/>
+              <w:right w:val="single" w:color="A6A6A6" w:sz="4"/>
+            </w:tcBorders>
+            <w:shd w:fill="DCE9F5" w:color="auto" w:val="clear"/>
+            <w:tcMar>
+              <w:top w:type="dxa" w:w="60"/>
+              <w:left w:type="dxa" w:w="100"/>
+              <w:bottom w:type="dxa" w:w="60"/>
+              <w:right w:type="dxa" w:w="100"/>
+            </w:tcMar>
+          </w:tcPr>
+          <w:p>
+            <w:r>
+              <w:rPr>
+                <w:b w:val="false"/>
+                <w:bCs w:val="false"/>
+                <w:sz w:val="20"/>
+                <w:szCs w:val="20"/>
+              </w:rPr>
+              <w:t>Paso 5.0 aprobado: plan de la fase 5 (Pruebas) en seis pasos (5a a 5f). Playwright en e2e/ para las pruebas de punta a punta; umbral de cobertura (80 % backend, 85 % web) después de cubrir los huecos; Mockito solo donde una prueba de integración no llegue. Ramas test/... para el trabajo que solo añade pruebas.</w:t>
             </w:r>
           </w:p>
         </w:tc>

</xml_diff>

<commit_message>
docs: 5b en la matriz, el plan de pruebas, AGENTS.md y Doc.docx; 5a fusionado (PR #15)
Co-Authored-By: Claude Opus 5.5 <noreply@anthropic.com>
Claude-Session: https://claude.ai/code/session_0172dfum7zSk4ESv4kuduVrN
</commit_message>
<xml_diff>
--- a/docs/Doc.docx
+++ b/docs/Doc.docx
@@ -29411,7 +29411,7 @@
                 <w:sz w:val="20"/>
                 <w:szCs w:val="20"/>
               </w:rPr>
-              <w:t>Pruebas de los huecos de la matriz, matriz de permisos que recorre todos los endpoints con los cuatro perfiles (RNF-002) y umbral mínimo de cobertura en la CI (80 % backend, 85 % web).</w:t>
+              <w:t>Matriz de permisos del backend (PermisosTest: los 54 endpoints con cinco perfiles) y de la web (Permisos.test: todas las rutas con cinco perfiles); las dos fallan si se añade un endpoint o una ruta sin decidir quién puede usarlo. ArchUnit comprueba las reglas de arquitectura del paso 3.2. Pruebas de los huecos de la matriz y del envío de correo (con Mockito). Mínimo de cobertura en la CI: 95 % de líneas y 85 % de ramas en el backend, 90 % y 80 % en la web. Tras el paso: 512 pruebas en el backend (98,1 % de líneas) y 293 en la web (92,6 %).</w:t>
             </w:r>
           </w:p>
         </w:tc>
@@ -32893,6 +32893,126 @@
                 <w:szCs w:val="20"/>
               </w:rPr>
               <w:t>Paso 5.0 aprobado: plan de la fase 5 (Pruebas) en seis pasos (5a a 5f). Playwright en e2e/ para las pruebas de punta a punta; umbral de cobertura (80 % backend, 85 % web) después de cubrir los huecos; Mockito solo donde una prueba de integración no llegue. Ramas test/... para el trabajo que solo añade pruebas.</w:t>
+            </w:r>
+          </w:p>
+        </w:tc>
+      </w:tr>
+      <w:tr>
+        <w:tc>
+          <w:tcPr>
+            <w:tcW w:type="dxa" w:w="1700"/>
+            <w:tcBorders>
+              <w:top w:val="single" w:color="A6A6A6" w:sz="4"/>
+              <w:left w:val="single" w:color="A6A6A6" w:sz="4"/>
+              <w:bottom w:val="single" w:color="A6A6A6" w:sz="4"/>
+              <w:right w:val="single" w:color="A6A6A6" w:sz="4"/>
+            </w:tcBorders>
+            <w:shd w:fill="DCE9F5" w:color="auto" w:val="clear"/>
+            <w:tcMar>
+              <w:top w:type="dxa" w:w="60"/>
+              <w:left w:type="dxa" w:w="100"/>
+              <w:bottom w:type="dxa" w:w="60"/>
+              <w:right w:type="dxa" w:w="100"/>
+            </w:tcMar>
+          </w:tcPr>
+          <w:p>
+            <w:r>
+              <w:rPr>
+                <w:b w:val="false"/>
+                <w:bCs w:val="false"/>
+                <w:sz w:val="20"/>
+                <w:szCs w:val="20"/>
+              </w:rPr>
+              <w:t>31/10/2026</w:t>
+            </w:r>
+          </w:p>
+        </w:tc>
+        <w:tc>
+          <w:tcPr>
+            <w:tcW w:type="dxa" w:w="7326"/>
+            <w:tcBorders>
+              <w:top w:val="single" w:color="A6A6A6" w:sz="4"/>
+              <w:left w:val="single" w:color="A6A6A6" w:sz="4"/>
+              <w:bottom w:val="single" w:color="A6A6A6" w:sz="4"/>
+              <w:right w:val="single" w:color="A6A6A6" w:sz="4"/>
+            </w:tcBorders>
+            <w:shd w:fill="DCE9F5" w:color="auto" w:val="clear"/>
+            <w:tcMar>
+              <w:top w:type="dxa" w:w="60"/>
+              <w:left w:type="dxa" w:w="100"/>
+              <w:bottom w:type="dxa" w:w="60"/>
+              <w:right w:type="dxa" w:w="100"/>
+            </w:tcMar>
+          </w:tcPr>
+          <w:p>
+            <w:r>
+              <w:rPr>
+                <w:b w:val="false"/>
+                <w:bCs w:val="false"/>
+                <w:sz w:val="20"/>
+                <w:szCs w:val="20"/>
+              </w:rPr>
+              <w:t>5a fusionado (PR #15).</w:t>
+            </w:r>
+          </w:p>
+        </w:tc>
+      </w:tr>
+      <w:tr>
+        <w:tc>
+          <w:tcPr>
+            <w:tcW w:type="dxa" w:w="1700"/>
+            <w:tcBorders>
+              <w:top w:val="single" w:color="A6A6A6" w:sz="4"/>
+              <w:left w:val="single" w:color="A6A6A6" w:sz="4"/>
+              <w:bottom w:val="single" w:color="A6A6A6" w:sz="4"/>
+              <w:right w:val="single" w:color="A6A6A6" w:sz="4"/>
+            </w:tcBorders>
+            <w:shd w:fill="DCE9F5" w:color="auto" w:val="clear"/>
+            <w:tcMar>
+              <w:top w:type="dxa" w:w="60"/>
+              <w:left w:type="dxa" w:w="100"/>
+              <w:bottom w:type="dxa" w:w="60"/>
+              <w:right w:type="dxa" w:w="100"/>
+            </w:tcMar>
+          </w:tcPr>
+          <w:p>
+            <w:r>
+              <w:rPr>
+                <w:b w:val="false"/>
+                <w:bCs w:val="false"/>
+                <w:sz w:val="20"/>
+                <w:szCs w:val="20"/>
+              </w:rPr>
+              <w:t>31/10/2026</w:t>
+            </w:r>
+          </w:p>
+        </w:tc>
+        <w:tc>
+          <w:tcPr>
+            <w:tcW w:type="dxa" w:w="7326"/>
+            <w:tcBorders>
+              <w:top w:val="single" w:color="A6A6A6" w:sz="4"/>
+              <w:left w:val="single" w:color="A6A6A6" w:sz="4"/>
+              <w:bottom w:val="single" w:color="A6A6A6" w:sz="4"/>
+              <w:right w:val="single" w:color="A6A6A6" w:sz="4"/>
+            </w:tcBorders>
+            <w:shd w:fill="DCE9F5" w:color="auto" w:val="clear"/>
+            <w:tcMar>
+              <w:top w:type="dxa" w:w="60"/>
+              <w:left w:type="dxa" w:w="100"/>
+              <w:bottom w:type="dxa" w:w="60"/>
+              <w:right w:type="dxa" w:w="100"/>
+            </w:tcMar>
+          </w:tcPr>
+          <w:p>
+            <w:r>
+              <w:rPr>
+                <w:b w:val="false"/>
+                <w:bCs w:val="false"/>
+                <w:sz w:val="20"/>
+                <w:szCs w:val="20"/>
+              </w:rPr>
+              <w:t>5b aprobado: matrices de permisos del backend y de la web, ArchUnit, Mockito para el envío de correo, mínimo de cobertura 95/85 en el backend y 90/80 en la web, y se borra EstadoCita.ocupa(), que nadie usaba.</w:t>
             </w:r>
           </w:p>
         </w:tc>

</xml_diff>

<commit_message>
test(e2e): pruebas de punta a punta con Playwright (paso 5c)
- e2e/: siete flujos en Chromium contra la web, el backend, PostgreSQL y
  Mailpit reales (cliente, menor, empleado, horarios, reserva del admin,
  recuperar la contraseña y RGPD). Cada prueba prepara sus datos por la API
  con nombres únicos y van en paralelo.
- playwright.config.ts arranca el .jar y vite preview con todas las
  variables explícitas: base de datos gestion_de_citas_e2e, administrador
  propio, sin perfil demo y límite de inicios de sesión alto.
- CI: trabajo e2e tras backend y frontend, con PostgreSQL y Mailpit como
  servicios y el informe de Playwright como artefacto si falla.
- Guía docs/guias/pruebas-e2e.md; plan, matriz (columna E2E), AGENTS.md,
  Doc.docx y propuesta 5.3 aprobada.

Sin cambios en el código de la aplicación.

Co-Authored-By: Claude Opus 5.5 <noreply@anthropic.com>
Claude-Session: https://claude.ai/code/session_0172dfum7zSk4ESv4kuduVrN
</commit_message>
<xml_diff>
--- a/docs/Doc.docx
+++ b/docs/Doc.docx
@@ -29469,7 +29469,7 @@
                 <w:sz w:val="20"/>
                 <w:szCs w:val="20"/>
               </w:rPr>
-              <w:t>Playwright en e2e/ con la web, el backend y PostgreSQL reales; un flujo principal por perfil.</w:t>
+              <w:t>Playwright en e2e/ con la web, el backend, PostgreSQL y Mailpit reales, en Chromium: siete flujos (cliente, menor, empleado, horarios, reserva del admin, recuperar la contraseña y RGPD), cada uno con sus propios datos y en paralelo. Base de datos aparte (gestion_de_citas_e2e) y límite de inicios de sesión alto solo en estas pruebas. Tercer trabajo de la CI (e2e) tras el backend y la web, con el informe de Playwright como artefacto si falla. Guía en docs/guias/pruebas-e2e.md.</w:t>
             </w:r>
           </w:p>
         </w:tc>
@@ -33013,6 +33013,126 @@
                 <w:szCs w:val="20"/>
               </w:rPr>
               <w:t>5b aprobado: matrices de permisos del backend y de la web, ArchUnit, Mockito para el envío de correo, mínimo de cobertura 95/85 en el backend y 90/80 en la web, y se borra EstadoCita.ocupa(), que nadie usaba.</w:t>
+            </w:r>
+          </w:p>
+        </w:tc>
+      </w:tr>
+      <w:tr>
+        <w:tc>
+          <w:tcPr>
+            <w:tcW w:type="dxa" w:w="1700"/>
+            <w:tcBorders>
+              <w:top w:val="single" w:color="A6A6A6" w:sz="4"/>
+              <w:left w:val="single" w:color="A6A6A6" w:sz="4"/>
+              <w:bottom w:val="single" w:color="A6A6A6" w:sz="4"/>
+              <w:right w:val="single" w:color="A6A6A6" w:sz="4"/>
+            </w:tcBorders>
+            <w:shd w:fill="DCE9F5" w:color="auto" w:val="clear"/>
+            <w:tcMar>
+              <w:top w:type="dxa" w:w="60"/>
+              <w:left w:type="dxa" w:w="100"/>
+              <w:bottom w:type="dxa" w:w="60"/>
+              <w:right w:type="dxa" w:w="100"/>
+            </w:tcMar>
+          </w:tcPr>
+          <w:p>
+            <w:r>
+              <w:rPr>
+                <w:b w:val="false"/>
+                <w:bCs w:val="false"/>
+                <w:sz w:val="20"/>
+                <w:szCs w:val="20"/>
+              </w:rPr>
+              <w:t>31/10/2026</w:t>
+            </w:r>
+          </w:p>
+        </w:tc>
+        <w:tc>
+          <w:tcPr>
+            <w:tcW w:type="dxa" w:w="7326"/>
+            <w:tcBorders>
+              <w:top w:val="single" w:color="A6A6A6" w:sz="4"/>
+              <w:left w:val="single" w:color="A6A6A6" w:sz="4"/>
+              <w:bottom w:val="single" w:color="A6A6A6" w:sz="4"/>
+              <w:right w:val="single" w:color="A6A6A6" w:sz="4"/>
+            </w:tcBorders>
+            <w:shd w:fill="DCE9F5" w:color="auto" w:val="clear"/>
+            <w:tcMar>
+              <w:top w:type="dxa" w:w="60"/>
+              <w:left w:type="dxa" w:w="100"/>
+              <w:bottom w:type="dxa" w:w="60"/>
+              <w:right w:type="dxa" w:w="100"/>
+            </w:tcMar>
+          </w:tcPr>
+          <w:p>
+            <w:r>
+              <w:rPr>
+                <w:b w:val="false"/>
+                <w:bCs w:val="false"/>
+                <w:sz w:val="20"/>
+                <w:szCs w:val="20"/>
+              </w:rPr>
+              <w:t>5b fusionado (PR #16).</w:t>
+            </w:r>
+          </w:p>
+        </w:tc>
+      </w:tr>
+      <w:tr>
+        <w:tc>
+          <w:tcPr>
+            <w:tcW w:type="dxa" w:w="1700"/>
+            <w:tcBorders>
+              <w:top w:val="single" w:color="A6A6A6" w:sz="4"/>
+              <w:left w:val="single" w:color="A6A6A6" w:sz="4"/>
+              <w:bottom w:val="single" w:color="A6A6A6" w:sz="4"/>
+              <w:right w:val="single" w:color="A6A6A6" w:sz="4"/>
+            </w:tcBorders>
+            <w:shd w:fill="DCE9F5" w:color="auto" w:val="clear"/>
+            <w:tcMar>
+              <w:top w:type="dxa" w:w="60"/>
+              <w:left w:type="dxa" w:w="100"/>
+              <w:bottom w:type="dxa" w:w="60"/>
+              <w:right w:type="dxa" w:w="100"/>
+            </w:tcMar>
+          </w:tcPr>
+          <w:p>
+            <w:r>
+              <w:rPr>
+                <w:b w:val="false"/>
+                <w:bCs w:val="false"/>
+                <w:sz w:val="20"/>
+                <w:szCs w:val="20"/>
+              </w:rPr>
+              <w:t>31/10/2026</w:t>
+            </w:r>
+          </w:p>
+        </w:tc>
+        <w:tc>
+          <w:tcPr>
+            <w:tcW w:type="dxa" w:w="7326"/>
+            <w:tcBorders>
+              <w:top w:val="single" w:color="A6A6A6" w:sz="4"/>
+              <w:left w:val="single" w:color="A6A6A6" w:sz="4"/>
+              <w:bottom w:val="single" w:color="A6A6A6" w:sz="4"/>
+              <w:right w:val="single" w:color="A6A6A6" w:sz="4"/>
+            </w:tcBorders>
+            <w:shd w:fill="DCE9F5" w:color="auto" w:val="clear"/>
+            <w:tcMar>
+              <w:top w:type="dxa" w:w="60"/>
+              <w:left w:type="dxa" w:w="100"/>
+              <w:bottom w:type="dxa" w:w="60"/>
+              <w:right w:type="dxa" w:w="100"/>
+            </w:tcMar>
+          </w:tcPr>
+          <w:p>
+            <w:r>
+              <w:rPr>
+                <w:b w:val="false"/>
+                <w:bCs w:val="false"/>
+                <w:sz w:val="20"/>
+                <w:szCs w:val="20"/>
+              </w:rPr>
+              <w:t>5c aprobado: pruebas de punta a punta con Playwright en e2e/, siete flujos. Límite de inicios de sesión subido solo en las E2E (APP_SECURITY_INTENTOSLOGINPORMINUTO=1000), solo Chromium, base de datos aparte en el PC y trabajo e2e en la CI en cada PR y en cada push a main. Sin cambios en el código de la aplicación.</w:t>
             </w:r>
           </w:p>
         </w:tc>

</xml_diff>

<commit_message>
test(e2e): móvil, accesibilidad, reserva simultánea y seguridad básica (paso 5d)
- Proyecto movil de Playwright (Chromium a 390 px) con los flujos del
  cliente; irA, cerrarSesion e iniciarSesion abren el menú plegado.
- movil.spec.ts: sin desplazamiento horizontal y toques de 44 x 44 px.
- accesibilidad.spec.ts: axe (WCAG 2.1 A y AA) en 33 páginas, en modo claro
  y oscuro; fallan los fallos graves y críticos.
- concurrencia.spec.ts: dos navegadores confirman la misma hora a la vez.
- seguridad.spec.ts: cookie del refresh, almacenamiento del navegador,
  cabeceras del backend y respuestas sin hashes.
- Matriz (H-6 y H-8 cerrados), plan, guía, AGENTS.md, Doc.docx y
  propuesta 5.4 aprobada.

Co-Authored-By: Claude Opus 5.5 <noreply@anthropic.com>
Claude-Session: https://claude.ai/code/session_0172dfum7zSk4ESv4kuduVrN
</commit_message>
<xml_diff>
--- a/docs/Doc.docx
+++ b/docs/Doc.docx
@@ -29527,7 +29527,7 @@
                 <w:sz w:val="20"/>
                 <w:szCs w:val="20"/>
               </w:rPr>
-              <w:t>Móvil (RNF-008), accesibilidad con axe, reserva simultánea desde dos navegadores (RNF-003) y comprobaciones de seguridad básicas.</w:t>
+              <w:t>Dentro de e2e/: proyecto movil de Playwright (Chromium a 390 px) con los flujos del cliente, y comprobación de que ninguna página se sale de la pantalla y de que lo que se toca mide al menos 44 px. axe (WCAG 2.1 A y AA) en 33 páginas de los cuatro perfiles, en modo claro y oscuro. Reserva simultánea desde dos navegadores. Seguridad básica: cookie del refresh HttpOnly, Secure y SameSite=Strict, el token no se guarda en el navegador, cabeceras del backend y ninguna respuesta con hashes. Defectos encontrados y arreglados: los enlaces del menú del móvil medían 40 px y dos aria-label no contenían su texto visible.</w:t>
             </w:r>
           </w:p>
         </w:tc>
@@ -33133,6 +33133,126 @@
                 <w:szCs w:val="20"/>
               </w:rPr>
               <w:t>5c aprobado: pruebas de punta a punta con Playwright en e2e/, siete flujos. Límite de inicios de sesión subido solo en las E2E (APP_SECURITY_INTENTOSLOGINPORMINUTO=1000), solo Chromium, base de datos aparte en el PC y trabajo e2e en la CI en cada PR y en cada push a main. Sin cambios en el código de la aplicación.</w:t>
+            </w:r>
+          </w:p>
+        </w:tc>
+      </w:tr>
+      <w:tr>
+        <w:tc>
+          <w:tcPr>
+            <w:tcW w:type="dxa" w:w="1700"/>
+            <w:tcBorders>
+              <w:top w:val="single" w:color="A6A6A6" w:sz="4"/>
+              <w:left w:val="single" w:color="A6A6A6" w:sz="4"/>
+              <w:bottom w:val="single" w:color="A6A6A6" w:sz="4"/>
+              <w:right w:val="single" w:color="A6A6A6" w:sz="4"/>
+            </w:tcBorders>
+            <w:shd w:fill="DCE9F5" w:color="auto" w:val="clear"/>
+            <w:tcMar>
+              <w:top w:type="dxa" w:w="60"/>
+              <w:left w:type="dxa" w:w="100"/>
+              <w:bottom w:type="dxa" w:w="60"/>
+              <w:right w:type="dxa" w:w="100"/>
+            </w:tcMar>
+          </w:tcPr>
+          <w:p>
+            <w:r>
+              <w:rPr>
+                <w:b w:val="false"/>
+                <w:bCs w:val="false"/>
+                <w:sz w:val="20"/>
+                <w:szCs w:val="20"/>
+              </w:rPr>
+              <w:t>31/10/2026</w:t>
+            </w:r>
+          </w:p>
+        </w:tc>
+        <w:tc>
+          <w:tcPr>
+            <w:tcW w:type="dxa" w:w="7326"/>
+            <w:tcBorders>
+              <w:top w:val="single" w:color="A6A6A6" w:sz="4"/>
+              <w:left w:val="single" w:color="A6A6A6" w:sz="4"/>
+              <w:bottom w:val="single" w:color="A6A6A6" w:sz="4"/>
+              <w:right w:val="single" w:color="A6A6A6" w:sz="4"/>
+            </w:tcBorders>
+            <w:shd w:fill="DCE9F5" w:color="auto" w:val="clear"/>
+            <w:tcMar>
+              <w:top w:type="dxa" w:w="60"/>
+              <w:left w:type="dxa" w:w="100"/>
+              <w:bottom w:type="dxa" w:w="60"/>
+              <w:right w:type="dxa" w:w="100"/>
+            </w:tcMar>
+          </w:tcPr>
+          <w:p>
+            <w:r>
+              <w:rPr>
+                <w:b w:val="false"/>
+                <w:bCs w:val="false"/>
+                <w:sz w:val="20"/>
+                <w:szCs w:val="20"/>
+              </w:rPr>
+              <w:t>5c fusionado (PR #17).</w:t>
+            </w:r>
+          </w:p>
+        </w:tc>
+      </w:tr>
+      <w:tr>
+        <w:tc>
+          <w:tcPr>
+            <w:tcW w:type="dxa" w:w="1700"/>
+            <w:tcBorders>
+              <w:top w:val="single" w:color="A6A6A6" w:sz="4"/>
+              <w:left w:val="single" w:color="A6A6A6" w:sz="4"/>
+              <w:bottom w:val="single" w:color="A6A6A6" w:sz="4"/>
+              <w:right w:val="single" w:color="A6A6A6" w:sz="4"/>
+            </w:tcBorders>
+            <w:shd w:fill="DCE9F5" w:color="auto" w:val="clear"/>
+            <w:tcMar>
+              <w:top w:type="dxa" w:w="60"/>
+              <w:left w:type="dxa" w:w="100"/>
+              <w:bottom w:type="dxa" w:w="60"/>
+              <w:right w:type="dxa" w:w="100"/>
+            </w:tcMar>
+          </w:tcPr>
+          <w:p>
+            <w:r>
+              <w:rPr>
+                <w:b w:val="false"/>
+                <w:bCs w:val="false"/>
+                <w:sz w:val="20"/>
+                <w:szCs w:val="20"/>
+              </w:rPr>
+              <w:t>31/10/2026</w:t>
+            </w:r>
+          </w:p>
+        </w:tc>
+        <w:tc>
+          <w:tcPr>
+            <w:tcW w:type="dxa" w:w="7326"/>
+            <w:tcBorders>
+              <w:top w:val="single" w:color="A6A6A6" w:sz="4"/>
+              <w:left w:val="single" w:color="A6A6A6" w:sz="4"/>
+              <w:bottom w:val="single" w:color="A6A6A6" w:sz="4"/>
+              <w:right w:val="single" w:color="A6A6A6" w:sz="4"/>
+            </w:tcBorders>
+            <w:shd w:fill="DCE9F5" w:color="auto" w:val="clear"/>
+            <w:tcMar>
+              <w:top w:type="dxa" w:w="60"/>
+              <w:left w:type="dxa" w:w="100"/>
+              <w:bottom w:type="dxa" w:w="60"/>
+              <w:right w:type="dxa" w:w="100"/>
+            </w:tcMar>
+          </w:tcPr>
+          <w:p>
+            <w:r>
+              <w:rPr>
+                <w:b w:val="false"/>
+                <w:bCs w:val="false"/>
+                <w:sz w:val="20"/>
+                <w:szCs w:val="20"/>
+              </w:rPr>
+              <w:t>5d aprobado: proyecto movil (390 px) solo con los flujos del cliente; axe en todas las páginas en modo claro y oscuro, con los fallos graves pequeños arreglados en el mismo PR; reserva simultánea desde dos navegadores; seguridad básica. Las cabeceras de la web y el análisis de dependencias, en la fase 7.</w:t>
             </w:r>
           </w:p>
         </w:tc>

</xml_diff>

<commit_message>
docs(pruebas): lista de pruebas manuales (paso 5e)
- docs/pruebas/pruebas-manuales.md: una hora con el perfil demo, en ocho
  bloques (primera impresión, textos, aspecto, móvil, teclado, correos,
  otro navegador y situaciones raras) y la tabla de defectos.
- Plan, matriz (RNF-005), AGENTS.md, Doc.docx y propuesta 5.5 aprobada;
  "5d fusionado (PR #18)" y "5e aprobado" en el registro de decisiones.

Co-Authored-By: Claude Opus 5.5 <noreply@anthropic.com>
Claude-Session: https://claude.ai/code/session_0172dfum7zSk4ESv4kuduVrN
</commit_message>
<xml_diff>
--- a/docs/Doc.docx
+++ b/docs/Doc.docx
@@ -29585,7 +29585,7 @@
                 <w:sz w:val="20"/>
                 <w:szCs w:val="20"/>
               </w:rPr>
-              <w:t>Lista de comprobación para el perfil demo; cada defecto se arregla en una rama fix/... con una prueba que lo reproduce.</w:t>
+              <w:t>Lista de pruebas manuales de una hora (docs/pruebas/pruebas-manuales.md) que pasa el usuario con el perfil demo: primera impresión, textos, aspecto en claro y oscuro, su móvil, solo teclado, correos en Mailpit, Firefox y situaciones raras. Cada defecto se apunta (M-1, M-2…) y se arregla en una rama fix/... con una prueba que lo reproduzca; las mejoras se apuntan para después de la primera versión.</w:t>
             </w:r>
           </w:p>
         </w:tc>
@@ -33253,6 +33253,126 @@
                 <w:szCs w:val="20"/>
               </w:rPr>
               <w:t>5d aprobado: proyecto movil (390 px) solo con los flujos del cliente; axe en todas las páginas en modo claro y oscuro, con los fallos graves pequeños arreglados en el mismo PR; reserva simultánea desde dos navegadores; seguridad básica. Las cabeceras de la web y el análisis de dependencias, en la fase 7.</w:t>
+            </w:r>
+          </w:p>
+        </w:tc>
+      </w:tr>
+      <w:tr>
+        <w:tc>
+          <w:tcPr>
+            <w:tcW w:type="dxa" w:w="1700"/>
+            <w:tcBorders>
+              <w:top w:val="single" w:color="A6A6A6" w:sz="4"/>
+              <w:left w:val="single" w:color="A6A6A6" w:sz="4"/>
+              <w:bottom w:val="single" w:color="A6A6A6" w:sz="4"/>
+              <w:right w:val="single" w:color="A6A6A6" w:sz="4"/>
+            </w:tcBorders>
+            <w:shd w:fill="DCE9F5" w:color="auto" w:val="clear"/>
+            <w:tcMar>
+              <w:top w:type="dxa" w:w="60"/>
+              <w:left w:type="dxa" w:w="100"/>
+              <w:bottom w:type="dxa" w:w="60"/>
+              <w:right w:type="dxa" w:w="100"/>
+            </w:tcMar>
+          </w:tcPr>
+          <w:p>
+            <w:r>
+              <w:rPr>
+                <w:b w:val="false"/>
+                <w:bCs w:val="false"/>
+                <w:sz w:val="20"/>
+                <w:szCs w:val="20"/>
+              </w:rPr>
+              <w:t>31/10/2026</w:t>
+            </w:r>
+          </w:p>
+        </w:tc>
+        <w:tc>
+          <w:tcPr>
+            <w:tcW w:type="dxa" w:w="7326"/>
+            <w:tcBorders>
+              <w:top w:val="single" w:color="A6A6A6" w:sz="4"/>
+              <w:left w:val="single" w:color="A6A6A6" w:sz="4"/>
+              <w:bottom w:val="single" w:color="A6A6A6" w:sz="4"/>
+              <w:right w:val="single" w:color="A6A6A6" w:sz="4"/>
+            </w:tcBorders>
+            <w:shd w:fill="DCE9F5" w:color="auto" w:val="clear"/>
+            <w:tcMar>
+              <w:top w:type="dxa" w:w="60"/>
+              <w:left w:type="dxa" w:w="100"/>
+              <w:bottom w:type="dxa" w:w="60"/>
+              <w:right w:type="dxa" w:w="100"/>
+            </w:tcMar>
+          </w:tcPr>
+          <w:p>
+            <w:r>
+              <w:rPr>
+                <w:b w:val="false"/>
+                <w:bCs w:val="false"/>
+                <w:sz w:val="20"/>
+                <w:szCs w:val="20"/>
+              </w:rPr>
+              <w:t>5d fusionado (PR #18).</w:t>
+            </w:r>
+          </w:p>
+        </w:tc>
+      </w:tr>
+      <w:tr>
+        <w:tc>
+          <w:tcPr>
+            <w:tcW w:type="dxa" w:w="1700"/>
+            <w:tcBorders>
+              <w:top w:val="single" w:color="A6A6A6" w:sz="4"/>
+              <w:left w:val="single" w:color="A6A6A6" w:sz="4"/>
+              <w:bottom w:val="single" w:color="A6A6A6" w:sz="4"/>
+              <w:right w:val="single" w:color="A6A6A6" w:sz="4"/>
+            </w:tcBorders>
+            <w:shd w:fill="DCE9F5" w:color="auto" w:val="clear"/>
+            <w:tcMar>
+              <w:top w:type="dxa" w:w="60"/>
+              <w:left w:type="dxa" w:w="100"/>
+              <w:bottom w:type="dxa" w:w="60"/>
+              <w:right w:type="dxa" w:w="100"/>
+            </w:tcMar>
+          </w:tcPr>
+          <w:p>
+            <w:r>
+              <w:rPr>
+                <w:b w:val="false"/>
+                <w:bCs w:val="false"/>
+                <w:sz w:val="20"/>
+                <w:szCs w:val="20"/>
+              </w:rPr>
+              <w:t>31/10/2026</w:t>
+            </w:r>
+          </w:p>
+        </w:tc>
+        <w:tc>
+          <w:tcPr>
+            <w:tcW w:type="dxa" w:w="7326"/>
+            <w:tcBorders>
+              <w:top w:val="single" w:color="A6A6A6" w:sz="4"/>
+              <w:left w:val="single" w:color="A6A6A6" w:sz="4"/>
+              <w:bottom w:val="single" w:color="A6A6A6" w:sz="4"/>
+              <w:right w:val="single" w:color="A6A6A6" w:sz="4"/>
+            </w:tcBorders>
+            <w:shd w:fill="DCE9F5" w:color="auto" w:val="clear"/>
+            <w:tcMar>
+              <w:top w:type="dxa" w:w="60"/>
+              <w:left w:type="dxa" w:w="100"/>
+              <w:bottom w:type="dxa" w:w="60"/>
+              <w:right w:type="dxa" w:w="100"/>
+            </w:tcMar>
+          </w:tcPr>
+          <w:p>
+            <w:r>
+              <w:rPr>
+                <w:b w:val="false"/>
+                <w:bCs w:val="false"/>
+                <w:sz w:val="20"/>
+                <w:szCs w:val="20"/>
+              </w:rPr>
+              <w:t>5e aprobado: lista de pruebas manuales de una hora con el perfil demo, en Chrome o Edge, Firefox y el móvil; solo se arreglan los defectos, cada uno con una prueba que lo reproduzca; las mejoras, después de la primera versión.</w:t>
             </w:r>
           </w:p>
         </w:tc>

</xml_diff>

<commit_message>
docs(pruebas): registro de defectos con una ficha por defecto (D-1 a D-4)
- docs/pruebas/registro-de-defectos.md: cómo se apunta y se arregla un
  defecto, y fichas con qué se vio, la causa, la solución, el PR, la prueba
  que lo vigila y lo aprendido.
- Plan (§7), lista manual, guía de las E2E, AGENTS.md, Doc.docx y propuesta
  5.6 aprobada; "lista manual fusionada (PR #19)" en el registro de decisiones.

Co-Authored-By: Claude Opus 5.5 <noreply@anthropic.com>
Claude-Session: https://claude.ai/code/session_0172dfum7zSk4ESv4kuduVrN
</commit_message>
<xml_diff>
--- a/docs/Doc.docx
+++ b/docs/Doc.docx
@@ -29585,7 +29585,7 @@
                 <w:sz w:val="20"/>
                 <w:szCs w:val="20"/>
               </w:rPr>
-              <w:t>Lista de pruebas manuales de una hora (docs/pruebas/pruebas-manuales.md) que pasa el usuario con el perfil demo: primera impresión, textos, aspecto en claro y oscuro, su móvil, solo teclado, correos en Mailpit, Firefox y situaciones raras. Cada defecto se apunta (M-1, M-2…) y se arregla en una rama fix/... con una prueba que lo reproduzca; las mejoras se apuntan para después de la primera versión.</w:t>
+              <w:t>Lista de pruebas manuales de una hora (docs/pruebas/pruebas-manuales.md) que pasa el usuario con el perfil demo: primera impresión, textos, aspecto en claro y oscuro, su móvil, solo teclado, correos en Mailpit, Firefox y situaciones raras. Cada defecto se apunta (M-1, M-2…) y se arregla en una rama fix/... con una prueba que lo reproduzca; las mejoras se apuntan para después de la primera versión. Cada defecto tiene su ficha (D-n) en docs/pruebas/registro-de-defectos.md con la causa, la solución y lo aprendido.</w:t>
             </w:r>
           </w:p>
         </w:tc>
@@ -33373,6 +33373,126 @@
                 <w:szCs w:val="20"/>
               </w:rPr>
               <w:t>5e aprobado: lista de pruebas manuales de una hora con el perfil demo, en Chrome o Edge, Firefox y el móvil; solo se arreglan los defectos, cada uno con una prueba que lo reproduzca; las mejoras, después de la primera versión.</w:t>
+            </w:r>
+          </w:p>
+        </w:tc>
+      </w:tr>
+      <w:tr>
+        <w:tc>
+          <w:tcPr>
+            <w:tcW w:type="dxa" w:w="1700"/>
+            <w:tcBorders>
+              <w:top w:val="single" w:color="A6A6A6" w:sz="4"/>
+              <w:left w:val="single" w:color="A6A6A6" w:sz="4"/>
+              <w:bottom w:val="single" w:color="A6A6A6" w:sz="4"/>
+              <w:right w:val="single" w:color="A6A6A6" w:sz="4"/>
+            </w:tcBorders>
+            <w:shd w:fill="DCE9F5" w:color="auto" w:val="clear"/>
+            <w:tcMar>
+              <w:top w:type="dxa" w:w="60"/>
+              <w:left w:type="dxa" w:w="100"/>
+              <w:bottom w:type="dxa" w:w="60"/>
+              <w:right w:type="dxa" w:w="100"/>
+            </w:tcMar>
+          </w:tcPr>
+          <w:p>
+            <w:r>
+              <w:rPr>
+                <w:b w:val="false"/>
+                <w:bCs w:val="false"/>
+                <w:sz w:val="20"/>
+                <w:szCs w:val="20"/>
+              </w:rPr>
+              <w:t>31/10/2026</w:t>
+            </w:r>
+          </w:p>
+        </w:tc>
+        <w:tc>
+          <w:tcPr>
+            <w:tcW w:type="dxa" w:w="7326"/>
+            <w:tcBorders>
+              <w:top w:val="single" w:color="A6A6A6" w:sz="4"/>
+              <w:left w:val="single" w:color="A6A6A6" w:sz="4"/>
+              <w:bottom w:val="single" w:color="A6A6A6" w:sz="4"/>
+              <w:right w:val="single" w:color="A6A6A6" w:sz="4"/>
+            </w:tcBorders>
+            <w:shd w:fill="DCE9F5" w:color="auto" w:val="clear"/>
+            <w:tcMar>
+              <w:top w:type="dxa" w:w="60"/>
+              <w:left w:type="dxa" w:w="100"/>
+              <w:bottom w:type="dxa" w:w="60"/>
+              <w:right w:type="dxa" w:w="100"/>
+            </w:tcMar>
+          </w:tcPr>
+          <w:p>
+            <w:r>
+              <w:rPr>
+                <w:b w:val="false"/>
+                <w:bCs w:val="false"/>
+                <w:sz w:val="20"/>
+                <w:szCs w:val="20"/>
+              </w:rPr>
+              <w:t>Lista de pruebas manuales fusionada (PR #19).</w:t>
+            </w:r>
+          </w:p>
+        </w:tc>
+      </w:tr>
+      <w:tr>
+        <w:tc>
+          <w:tcPr>
+            <w:tcW w:type="dxa" w:w="1700"/>
+            <w:tcBorders>
+              <w:top w:val="single" w:color="A6A6A6" w:sz="4"/>
+              <w:left w:val="single" w:color="A6A6A6" w:sz="4"/>
+              <w:bottom w:val="single" w:color="A6A6A6" w:sz="4"/>
+              <w:right w:val="single" w:color="A6A6A6" w:sz="4"/>
+            </w:tcBorders>
+            <w:shd w:fill="DCE9F5" w:color="auto" w:val="clear"/>
+            <w:tcMar>
+              <w:top w:type="dxa" w:w="60"/>
+              <w:left w:type="dxa" w:w="100"/>
+              <w:bottom w:type="dxa" w:w="60"/>
+              <w:right w:type="dxa" w:w="100"/>
+            </w:tcMar>
+          </w:tcPr>
+          <w:p>
+            <w:r>
+              <w:rPr>
+                <w:b w:val="false"/>
+                <w:bCs w:val="false"/>
+                <w:sz w:val="20"/>
+                <w:szCs w:val="20"/>
+              </w:rPr>
+              <w:t>31/10/2026</w:t>
+            </w:r>
+          </w:p>
+        </w:tc>
+        <w:tc>
+          <w:tcPr>
+            <w:tcW w:type="dxa" w:w="7326"/>
+            <w:tcBorders>
+              <w:top w:val="single" w:color="A6A6A6" w:sz="4"/>
+              <w:left w:val="single" w:color="A6A6A6" w:sz="4"/>
+              <w:bottom w:val="single" w:color="A6A6A6" w:sz="4"/>
+              <w:right w:val="single" w:color="A6A6A6" w:sz="4"/>
+            </w:tcBorders>
+            <w:shd w:fill="DCE9F5" w:color="auto" w:val="clear"/>
+            <w:tcMar>
+              <w:top w:type="dxa" w:w="60"/>
+              <w:left w:type="dxa" w:w="100"/>
+              <w:bottom w:type="dxa" w:w="60"/>
+              <w:right w:type="dxa" w:w="100"/>
+            </w:tcMar>
+          </w:tcPr>
+          <w:p>
+            <w:r>
+              <w:rPr>
+                <w:b w:val="false"/>
+                <w:bCs w:val="false"/>
+                <w:sz w:val="20"/>
+                <w:szCs w:val="20"/>
+              </w:rPr>
+              <w:t>D-4 arreglado (fix/e2e-intermitente): tres pruebas E2E fallaron una vez en la CI porque rellenaban un campo de la página anterior con la misma etiqueta antes de que se pintase la nueva. Las pruebas esperan al título de la página nueva; si fallan, adjuntan las peticiones a la API y la CI guarda el registro del backend. Nuevo registro de defectos (docs/pruebas/registro-de-defectos.md) con una ficha por defecto: causa, solución, PR, prueba y lo aprendido.</w:t>
             </w:r>
           </w:p>
         </w:tc>

</xml_diff>